<commit_message>
Rewrite Smart Search roadmap doc in plain, non-technical language
Same structure and facts, but each section now favors short sentences
and everyday phrasing over jargon-dense technical prose (thresholds,
formulas, and API contracts moved out of narrative text into the
reference tables in Part IV, or dropped from the diagrams entirely).

Co-Authored-By: Claude Fable 5 <noreply@anthropic.com>
</commit_message>
<xml_diff>
--- a/recommendation-service/Smart_Search_Roadmap.docx
+++ b/recommendation-service/Smart_Search_Roadmap.docx
@@ -13,7 +13,7 @@
     <w:p>
       <w:pPr/>
       <w:r>
-        <w:t>Thiết kế hệ tìm kiếm hybrid: hiểu nhu cầu tự do bằng embedding ngữ nghĩa, kết hợp khớp tên truyền thống và xếp hạng cá nhân hoá từ hệ gợi ý AI sẵn có. Tài liệu chốt ngày 11/07/2026. Trạng thái triển khai: CẢ 3 PHASE A/B/C ĐÃ XONG + verify cùng ngày (chi tiết ở đầu mỗi mục phase) — hạng mục Smart Search hoàn tất theo đúng phạm vi thiết kế, việc còn lại là vận hành/quan sát số liệu thật. Tách riêng khỏi AI_Recommendation_Roadmap.docx (roadmap gợi ý đã hoàn tất Phase 0-3).</w:t>
+        <w:t>Nâng cấp tìm kiếm sản phẩm để hiểu đúng ý khách hàng thay vì chỉ so khớp tên, đồng thời ưu tiên sản phẩm hợp sở thích từng người. Tài liệu chốt ngày 11/07/2026 — cả 3 giai đoạn (A, B, C) đã hoàn thành và kiểm thử xong; phần còn lại chỉ là theo dõi vận hành. Tài liệu tách riêng khỏi AI_Recommendation_Roadmap.docx (roadmap hệ gợi ý sản phẩm, đã đóng ở Phase 3).</w:t>
       </w:r>
     </w:p>
     <w:p>
@@ -29,7 +29,7 @@
         <w:pStyle w:val="Heading2"/>
       </w:pPr>
       <w:r>
-        <w:t>1. Tìm kiếm hiện tại hoạt động thế nào</w:t>
+        <w:t>1. Cách tìm kiếm hiện tại</w:t>
       </w:r>
     </w:p>
     <w:p>
@@ -37,7 +37,7 @@
         <w:pStyle w:val="ListBullet"/>
       </w:pPr>
       <w:r>
-        <w:t>Toàn bộ "trí tuệ" nằm ở frontend: buildProductNameFilter() (client/src/utils/helper.jsx) tách từ, bỏ dấu (stripDiacritics), dựng chuỗi RSQL productName~'từ1' and productName~'từ2'.</w:t>
+        <w:t>Việc "hiểu" từ khoá chỉ diễn ra ở giao diện: tách từng từ, bỏ dấu, rồi tìm sản phẩm có tên chứa đúng các từ đó.</w:t>
       </w:r>
     </w:p>
     <w:p>
@@ -45,7 +45,7 @@
         <w:pStyle w:val="ListBullet"/>
       </w:pPr>
       <w:r>
-        <w:t>Server (GET products/search, spring-filter) chỉ dịch RSQL → SQL LIKE %...% — không index (wildcard đầu chuỗi nên B-Tree cũng vô dụng), không full-text, không hiểu ngữ nghĩa.</w:t>
+        <w:t>Máy chủ chỉ tìm sản phẩm có tên "chứa chuỗi ký tự" giống từ khoá — không có chỉ mục tìm kiếm, không hiểu ý nghĩa câu chữ.</w:t>
       </w:r>
     </w:p>
     <w:p>
@@ -53,7 +53,7 @@
         <w:pStyle w:val="ListBullet"/>
       </w:pPr>
       <w:r>
-        <w:t>Sắp xếp: map thẳng vào Spring Pageable (tên/giá/rating/bán chạy/mới nhất). Không có khái niệm "độ liên quan" — mặc định trả theo thứ tự id.</w:t>
+        <w:t>Sắp xếp mặc định không có khái niệm "mức độ liên quan" — chỉ theo tên, giá, đánh giá hoặc thứ tự tạo sản phẩm.</w:t>
       </w:r>
     </w:p>
     <w:p>
@@ -61,7 +61,7 @@
         <w:pStyle w:val="ListBullet"/>
       </w:pPr>
       <w:r>
-        <w:t>Product.description (MEDIUMTEXT) tồn tại nhưng chưa từng được search. Không có bảng tag/keyword nhu cầu.</w:t>
+        <w:t>Phần mô tả chi tiết của sản phẩm chưa từng được dùng để tìm kiếm.</w:t>
       </w:r>
     </w:p>
     <w:p>
@@ -69,7 +69,7 @@
         <w:pStyle w:val="ListBullet"/>
       </w:pPr>
       <w:r>
-        <w:t>SearchLog (Phase 0 hệ gợi ý) đã ghi keyword + keyword_normalized + resultCount + clickedProductId kèm index idx_sl_keyword_norm, nhưng CHƯA có bất kỳ consumer nào đọc lại.</w:t>
+        <w:t>Lịch sử các lượt tìm kiếm của khách đã được lưu từ trước nhưng chưa ai khai thác.</w:t>
       </w:r>
     </w:p>
     <w:p>
@@ -77,7 +77,7 @@
         <w:pStyle w:val="Heading2"/>
       </w:pPr>
       <w:r>
-        <w:t>2. Vấn đề cần giải</w:t>
+        <w:t>2. Vấn đề cần giải quyết</w:t>
       </w:r>
     </w:p>
     <w:p>
@@ -85,7 +85,7 @@
         <w:pStyle w:val="ListNumber"/>
       </w:pPr>
       <w:r>
-        <w:t>Người dùng tìm theo NHU CẦU chứ không chỉ tên: "đồ ăn ngon", "thực phẩm sạch", "đồ sấy"… — LIKE theo tên trả 0 kết quả với các query này.</w:t>
+        <w:t>Khách tìm theo NHU CẦU ("đồ ăn ngon", "đồ sấy"...) chứ không gõ đúng tên sản phẩm — hiện các tìm kiếm này trả về 0 kết quả.</w:t>
       </w:r>
     </w:p>
     <w:p>
@@ -93,13 +93,13 @@
         <w:pStyle w:val="ListNumber"/>
       </w:pPr>
       <w:r>
-        <w:t>Kết quả cần xếp mặc định theo "liên quan" kiểu Shopee: trong phạm vi vẫn khớp từ khoá + bộ lọc, sản phẩm hợp sở thích cá nhân của khách (đã có sẵn trong hệ gợi ý AI) phải đứng đầu.</w:t>
+        <w:t>Trong số các sản phẩm phù hợp, cần ưu tiên hiện lên trước những sản phẩm hợp sở thích riêng của từng khách (giống cách Shopee làm), miễn vẫn đúng bộ lọc và từ khoá.</w:t>
       </w:r>
     </w:p>
     <w:p>
       <w:pPr/>
       <w:r>
-        <w:t>Hướng đã chốt cùng chủ dự án: semantic/embedding thật (không dùng bảng từ khoá rule-based thủ công).</w:t>
+        <w:t>Hướng đã chọn: dùng công nghệ AI hiểu ngôn ngữ tự nhiên thật sự, không dùng danh sách từ khoá gán sẵn thủ công.</w:t>
       </w:r>
     </w:p>
     <w:p>
@@ -107,7 +107,7 @@
         <w:pStyle w:val="Heading2"/>
       </w:pPr>
       <w:r>
-        <w:t>3. Ràng buộc kế thừa từ hệ thống</w:t>
+        <w:t>3. Những ràng buộc phải tuân theo</w:t>
       </w:r>
     </w:p>
     <w:p>
@@ -115,7 +115,7 @@
         <w:pStyle w:val="ListBullet"/>
       </w:pPr>
       <w:r>
-        <w:t>Bug dấu tiếng Việt trong query param (root cause chưa rõ): mọi giá trị có dấu gửi qua query string đều có thể hỏng. Kinh nghiệm đã có: JSON body KHÔNG dính bug (các API tracking gửi tiếng Việt có dấu qua body thành công) → q bắt buộc đi qua POST body.</w:t>
+        <w:t>Chữ tiếng Việt có dấu gửi qua đường dẫn URL dễ bị lỗi (bug cũ đã biết của hệ thống) → từ khoá tìm kiếm phải gửi qua nội dung yêu cầu, không qua URL.</w:t>
       </w:r>
     </w:p>
     <w:p>
@@ -123,7 +123,7 @@
         <w:pStyle w:val="ListBullet"/>
       </w:pPr>
       <w:r>
-        <w:t>Bean recommendationRestTemplate timeout connect 2000ms / read 2500ms — TUYỆT ĐỐI không nới (phá fail-fast fallback của Home/PDP/Cart). Search mới dùng chung bean, chung kỷ luật.</w:t>
+        <w:t>Mỗi lần gọi sang dịch vụ AI chỉ được chờ tối đa 2–2,5 giây, không được nới thời gian chờ — để trang không bị treo nếu AI gặp sự cố.</w:t>
       </w:r>
     </w:p>
     <w:p>
@@ -131,7 +131,7 @@
         <w:pStyle w:val="ListBullet"/>
       </w:pPr>
       <w:r>
-        <w:t>Bài học thư viện Python trên Windows: implicit từng không build được (py3.12/numpy2) — mọi thư viện mới phải có spike script cài thử TRƯỚC khi thiết kế phụ thuộc vào nó.</w:t>
+        <w:t>Trước khi dùng thư viện AI mới phải thử cài đặt trước, vì từng có thư viện không cài được trên máy Windows đang dùng.</w:t>
       </w:r>
     </w:p>
     <w:p>
@@ -139,7 +139,7 @@
         <w:pStyle w:val="ListBullet"/>
       </w:pPr>
       <w:r>
-        <w:t>Rule bảo mật admin/public khai theo TỪNG HttpMethod — endpoint POST mới phải có rule riêng (bài học suýt lộ POST admin/recommendation-metrics/ab-pct).</w:t>
+        <w:t>Mọi API dành cho quản trị viên phải khai rõ quyền truy cập cho từng loại yêu cầu (GET/POST tách riêng) — từng suýt để lộ 1 API cho người dùng thường.</w:t>
       </w:r>
     </w:p>
     <w:p>
@@ -147,7 +147,7 @@
         <w:pStyle w:val="ListBullet"/>
       </w:pPr>
       <w:r>
-        <w:t>Filter cứng (active, quantity&gt;0, category, giá, rating, khuyến mãi) phải được tôn trọng tuyệt đối — semantic chỉ quyết định THỨ TỰ và mở rộng recall bên trong phạm vi filter.</w:t>
+        <w:t>Các điều kiện lọc cứng (còn hàng, đúng danh mục, đúng khoảng giá...) luôn phải được tôn trọng tuyệt đối; AI chỉ được quyền sắp xếp lại thứ tự, không được thêm sản phẩm ngoài phạm vi đã lọc.</w:t>
       </w:r>
     </w:p>
     <w:p>
@@ -163,13 +163,13 @@
         <w:pStyle w:val="Heading2"/>
       </w:pPr>
       <w:r>
-        <w:t>1. Model embedding: multilingual-e5-small qua ONNX Runtime</w:t>
+        <w:t>1. Công nghệ hiểu ngôn ngữ</w:t>
       </w:r>
     </w:p>
     <w:p>
       <w:pPr/>
       <w:r>
-        <w:t>Chọn intfloat/multilingual-e5-small (384 chiều, ~120MB): hỗ trợ tiếng Việt tốt (train trên kho đa ngữ có tiếng Việt), điểm retrieval đa ngữ cao hơn hẳn paraphrase-MiniLM cùng cỡ; all-MiniLM bị loại vì không hỗ trợ tiếng Việt. Repo HuggingFace của model có sẵn thư mục onnx/ — không cần PyTorch để export.</w:t>
+        <w:t>Chọn 1 mô hình AI nhỏ gọn (multilingual-e5-small), hiểu tốt tiếng Việt và chạy được ngay trên máy chủ hiện có mà không cần phần cứng đặc biệt.</w:t>
       </w:r>
     </w:p>
     <w:tbl>
@@ -190,7 +190,7 @@
           </w:tcPr>
           <w:p>
             <w:r>
-              <w:t>Bậc</w:t>
+              <w:t>Mức độ</w:t>
             </w:r>
           </w:p>
         </w:tc>
@@ -200,7 +200,7 @@
           </w:tcPr>
           <w:p>
             <w:r>
-              <w:t>Phương án</w:t>
+              <w:t>Cách chạy</w:t>
             </w:r>
           </w:p>
         </w:tc>
@@ -210,7 +210,7 @@
           </w:tcPr>
           <w:p>
             <w:r>
-              <w:t>Điều kiện dùng</w:t>
+              <w:t>Khi nào dùng</w:t>
             </w:r>
           </w:p>
         </w:tc>
@@ -222,7 +222,7 @@
           </w:tcPr>
           <w:p>
             <w:r>
-              <w:t>Plan A</w:t>
+              <w:t>Chính</w:t>
             </w:r>
           </w:p>
         </w:tc>
@@ -232,7 +232,7 @@
           </w:tcPr>
           <w:p>
             <w:r>
-              <w:t>onnxruntime + tokenizers + model ONNX tải sẵn (~120MB)</w:t>
+              <w:t>Chạy mô hình AI nhẹ trực tiếp trên máy chủ</w:t>
             </w:r>
           </w:p>
         </w:tc>
@@ -242,7 +242,7 @@
           </w:tcPr>
           <w:p>
             <w:r>
-              <w:t>Mặc định — wheel Windows prebuilt, né PyTorch ~2.5GB</w:t>
+              <w:t>Mặc định, luôn ưu tiên dùng</w:t>
             </w:r>
           </w:p>
         </w:tc>
@@ -254,7 +254,7 @@
           </w:tcPr>
           <w:p>
             <w:r>
-              <w:t>Plan B</w:t>
+              <w:t>Dự phòng 1</w:t>
             </w:r>
           </w:p>
         </w:tc>
@@ -264,7 +264,7 @@
           </w:tcPr>
           <w:p>
             <w:r>
-              <w:t>sentence-transformers + torch CPU (cùng model e5-small)</w:t>
+              <w:t>Chạy qua thư viện AI đầy đủ hơn (nặng hơn)</w:t>
             </w:r>
           </w:p>
         </w:tc>
@@ -274,7 +274,7 @@
           </w:tcPr>
           <w:p>
             <w:r>
-              <w:t>Nếu ONNX trục trặc khi spike</w:t>
+              <w:t>Chỉ dùng nếu cách chính gặp lỗi cài đặt</w:t>
             </w:r>
           </w:p>
         </w:tc>
@@ -286,7 +286,7 @@
           </w:tcPr>
           <w:p>
             <w:r>
-              <w:t>Plan C</w:t>
+              <w:t>Dự phòng 2</w:t>
             </w:r>
           </w:p>
         </w:tc>
@@ -296,7 +296,7 @@
           </w:tcPr>
           <w:p>
             <w:r>
-              <w:t>TF-IDF query-vector (persist vectorizer của content_based.py vào ModelArtifacts — hiện đang bị vứt sau build)</w:t>
+              <w:t>So khớp từ khoá kiểu truyền thống (không dùng AI)</w:t>
             </w:r>
           </w:p>
         </w:tc>
@@ -306,7 +306,7 @@
           </w:tcPr>
           <w:p>
             <w:r>
-              <w:t>Backend degrade LUÔN tồn tại trong code, không chỉ là dự phòng cài đặt</w:t>
+              <w:t>Luôn có sẵn — đảm bảo tìm kiếm không bao giờ ngừng hoạt động</w:t>
             </w:r>
           </w:p>
         </w:tc>
@@ -316,13 +316,13 @@
     <w:p>
       <w:pPr/>
       <w:r>
-        <w:t>Config search_embedding_backend: auto | onnx | torch | tfidf | off — auto thử lần lượt từng bậc, theo đúng pattern cf_backend đã dùng cho ALS.</w:t>
+        <w:t>Có thể chuyển đổi giữa các mức độ qua cấu hình, không cần sửa code.</w:t>
       </w:r>
     </w:p>
     <w:p>
       <w:pPr/>
       <w:r>
-        <w:t>Chi tiết bắt buộc của họ E5 (quên là chất lượng rớt thảm mà KHÔNG báo lỗi): prefix "query: " cho câu truy vấn, "passage: " cho document sản phẩm; pooling = mean-pooling trên token embeddings rồi l2-normalize. Ghi thẳng vào docstring encoder + có test sanity cosine cố định trong pytest.</w:t>
+        <w:t>Lưu ý kỹ thuật quan trọng: câu hỏi của khách và mô tả sản phẩm phải được đánh dấu khác nhau trước khi đưa vào mô hình AI — bỏ qua bước này thì chất lượng kết quả giảm mạnh mà không có cảnh báo lỗi nào, rất khó phát hiện nếu không kiểm tra kỹ.</w:t>
       </w:r>
     </w:p>
     <w:p>
@@ -330,7 +330,7 @@
         <w:pStyle w:val="Heading2"/>
       </w:pPr>
       <w:r>
-        <w:t>2. Hybrid recall — Java làm chủ filter và lexical, Python chỉ xếp hạng</w:t>
+        <w:t>2. Ai quyết định điều kiện lọc, ai xếp hạng</w:t>
       </w:r>
     </w:p>
     <w:p>
@@ -374,97 +374,7 @@
         <w:pStyle w:val="Caption"/>
       </w:pPr>
       <w:r>
-        <w:t>Sơ đồ 1 — Luồng tìm kiếm hybrid với 3 tầng fallback.</w:t>
-      </w:r>
-    </w:p>
-    <w:tbl>
-      <w:tblPr>
-        <w:tblW w:type="auto" w:w="0"/>
-        <w:tblLook w:firstColumn="1" w:firstRow="1" w:lastColumn="0" w:lastRow="0" w:noHBand="0" w:noVBand="1" w:val="04A0"/>
-      </w:tblPr>
-      <w:tblGrid>
-        <w:gridCol w:w="8640"/>
-      </w:tblGrid>
-      <w:tr>
-        <w:tc>
-          <w:tcPr>
-            <w:tcW w:type="dxa" w:w="8640"/>
-            <w:shd w:val="clear" w:fill="F3F6F4"/>
-            <w:tcBorders>
-              <w:top w:val="single" w:sz="4" w:space="0" w:color="C7D3CB"/>
-              <w:left w:val="single" w:sz="4" w:space="0" w:color="C7D3CB"/>
-              <w:bottom w:val="single" w:sz="4" w:space="0" w:color="C7D3CB"/>
-              <w:right w:val="single" w:sz="4" w:space="0" w:color="C7D3CB"/>
-            </w:tcBorders>
-          </w:tcPr>
-          <w:p>
-            <w:r>
-              <w:rPr>
-                <w:rFonts w:ascii="Consolas" w:hAnsi="Consolas"/>
-                <w:color w:val="2A3831"/>
-                <w:sz w:val="18"/>
-              </w:rPr>
-              <w:t>FE ── POST /products/smart-search ──▶ Java SmartSearchService</w:t>
-            </w:r>
-            <w:r>
-              <w:rPr>
-                <w:rFonts w:ascii="Consolas" w:hAnsi="Consolas"/>
-                <w:color w:val="2A3831"/>
-                <w:sz w:val="18"/>
-              </w:rPr>
-              <w:t xml:space="preserve">     body JSON {q có dấu, sessionId}       1. allowed_ids = SELECT id theo filter cứng (spec)</w:t>
-            </w:r>
-            <w:r>
-              <w:rPr>
-                <w:rFonts w:ascii="Consolas" w:hAnsi="Consolas"/>
-                <w:color w:val="2A3831"/>
-                <w:sz w:val="18"/>
-              </w:rPr>
-              <w:t xml:space="preserve">     query param: filter RSQL (ASCII)      2. lexical_ids = SELECT id theo filter + LIKE từng từ của q</w:t>
-            </w:r>
-            <w:r>
-              <w:rPr>
-                <w:rFonts w:ascii="Consolas" w:hAnsi="Consolas"/>
-                <w:color w:val="2A3831"/>
-                <w:sz w:val="18"/>
-              </w:rPr>
-              <w:t xml:space="preserve">                                           3. POST Python /search/rank {q, allowed_ids, lexical_ids,</w:t>
-            </w:r>
-            <w:r>
-              <w:rPr>
-                <w:rFonts w:ascii="Consolas" w:hAnsi="Consolas"/>
-                <w:color w:val="2A3831"/>
-                <w:sz w:val="18"/>
-              </w:rPr>
-              <w:t xml:space="preserve">                                              user_id (từ JWT), session_id, limit}</w:t>
-            </w:r>
-            <w:r>
-              <w:rPr>
-                <w:rFonts w:ascii="Consolas" w:hAnsi="Consolas"/>
-                <w:color w:val="2A3831"/>
-                <w:sz w:val="18"/>
-              </w:rPr>
-              <w:t xml:space="preserve">                                           4. ranked list → phân trang → hydrate DTO (giữ thứ tự)</w:t>
-            </w:r>
-            <w:r>
-              <w:rPr>
-                <w:rFonts w:ascii="Consolas" w:hAnsi="Consolas"/>
-                <w:color w:val="2A3831"/>
-                <w:sz w:val="18"/>
-              </w:rPr>
-              <w:t xml:space="preserve">                                           5. Mọi lỗi/timeout/rỗng bất thường → fallback LIKE như cũ</w:t>
-            </w:r>
-          </w:p>
-        </w:tc>
-      </w:tr>
-    </w:tbl>
-    <w:p/>
-    <w:p>
-      <w:pPr>
-        <w:pStyle w:val="ListBullet"/>
-      </w:pPr>
-      <w:r>
-        <w:t>Python CHỈ được chọn và xếp hạng trong allowed_ids — không bao giờ thêm id ngoài danh sách. Filter được tôn trọng bằng CẤU TRÚC, không phải bằng kỷ luật code.</w:t>
+        <w:t>Sơ đồ 1 — Luồng xử lý 1 lượt tìm kiếm, có 3 lớp dự phòng khi có sự cố.</w:t>
       </w:r>
     </w:p>
     <w:p>
@@ -472,7 +382,7 @@
         <w:pStyle w:val="ListBullet"/>
       </w:pPr>
       <w:r>
-        <w:t>candidates = lexical_ids ∪ {p ∈ allowed_ids : semantic ≥ ngưỡng, top-K} — "đồ ăn ngon" (lexical rỗng) vẫn ra kết quả từ nhánh semantic; "coca cola" ra đúng sản phẩm tên khớp đứng #1.</w:t>
+        <w:t>Khách gõ từ khoá → hệ thống lấy trước danh sách sản phẩm ĐÚNG điều kiện lọc (còn hàng, đúng danh mục, giá...).</w:t>
       </w:r>
     </w:p>
     <w:p>
@@ -480,7 +390,7 @@
         <w:pStyle w:val="ListBullet"/>
       </w:pPr>
       <w:r>
-        <w:t>Sản phẩm tạo MỚI sau lần train gần nhất (chưa có trong ma trận embedding của Python) vẫn xuất hiện qua đường lexical — loại bỏ vấn đề catalog Python cũ tối đa 24h.</w:t>
+        <w:t>Trong đúng danh sách đó, AI xếp hạng theo mức độ liên quan và sở thích khách hàng.</w:t>
       </w:r>
     </w:p>
     <w:p>
@@ -488,7 +398,7 @@
         <w:pStyle w:val="ListBullet"/>
       </w:pPr>
       <w:r>
-        <w:t>q có dấu chỉ đi qua JSON body; chuỗi filter RSQL chỉ chứa id/số/enum ASCII nên vẫn đi query param, tái dùng binding @Filter sẵn có.</w:t>
+        <w:t>Kết quả được phân trang và hiển thị với giá luôn lấy mới nhất từ hệ thống.</w:t>
       </w:r>
     </w:p>
     <w:p>
@@ -496,7 +406,23 @@
         <w:pStyle w:val="ListBullet"/>
       </w:pPr>
       <w:r>
-        <w:t>Guard phía Java: recommendation.search.max-candidates=2000 — catalog vượt ngưỡng thì bỏ semantic, đi thẳng LIKE (bảo hiểm cho tương lai catalog phình; hiện tại vài trăm sản phẩm, list id vài KB).</w:t>
+        <w:t>Sản phẩm mới thêm gần đây (AI chưa kịp "học") vẫn xuất hiện được nhờ vẫn được so khớp tên bình thường.</w:t>
+      </w:r>
+    </w:p>
+    <w:p>
+      <w:pPr>
+        <w:pStyle w:val="ListBullet"/>
+      </w:pPr>
+      <w:r>
+        <w:t>Nếu bất kỳ bước nào lỗi, hệ thống tự động quay về cách tìm kiếm cũ (so khớp tên) — khách không bao giờ thấy lỗi.</w:t>
+      </w:r>
+    </w:p>
+    <w:p>
+      <w:pPr>
+        <w:pStyle w:val="ListBullet"/>
+      </w:pPr>
+      <w:r>
+        <w:t>Nguyên tắc quan trọng nhất: AI không bao giờ được thêm sản phẩm ngoài danh sách đã lọc sẵn — đảm bảo bộ lọc luôn đúng tuyệt đối.</w:t>
       </w:r>
     </w:p>
     <w:p>
@@ -504,7 +430,7 @@
         <w:pStyle w:val="Heading2"/>
       </w:pPr>
       <w:r>
-        <w:t>3. Công thức trộn điểm</w:t>
+        <w:t>3. Cách tính điểm xếp hạng</w:t>
       </w:r>
     </w:p>
     <w:p>
@@ -548,123 +474,235 @@
         <w:pStyle w:val="Caption"/>
       </w:pPr>
       <w:r>
-        <w:t>Sơ đồ 2 — Trộn 4 nguồn điểm + gate chống query vô nghĩa.</w:t>
+        <w:t>Sơ đồ 2 — 4 yếu tố được cộng lại để xếp hạng kết quả.</w:t>
+      </w:r>
+    </w:p>
+    <w:p>
+      <w:pPr/>
+      <w:r>
+        <w:t>4 yếu tố được cộng lại theo mức độ quan trọng khác nhau:</w:t>
+      </w:r>
+    </w:p>
+    <w:p>
+      <w:pPr>
+        <w:pStyle w:val="ListBullet"/>
+      </w:pPr>
+      <w:r>
+        <w:t>Khớp đúng tên sản phẩm — quan trọng nhất, ai gõ đúng tên phải thấy sản phẩm đó lên đầu.</w:t>
+      </w:r>
+    </w:p>
+    <w:p>
+      <w:pPr>
+        <w:pStyle w:val="ListBullet"/>
+      </w:pPr>
+      <w:r>
+        <w:t>Hiểu ý nghĩa — AI hiểu ý khách muốn tìm gì dù không gõ đúng tên.</w:t>
+      </w:r>
+    </w:p>
+    <w:p>
+      <w:pPr>
+        <w:pStyle w:val="ListBullet"/>
+      </w:pPr>
+      <w:r>
+        <w:t>Hợp sở thích cá nhân — tái sử dụng hệ thống gợi ý sản phẩm AI đã có sẵn.</w:t>
+      </w:r>
+    </w:p>
+    <w:p>
+      <w:pPr>
+        <w:pStyle w:val="ListBullet"/>
+      </w:pPr>
+      <w:r>
+        <w:t>Độ phổ biến — chỉ dùng để phân định khi các yếu tố trên gần như ngang nhau.</w:t>
+      </w:r>
+    </w:p>
+    <w:p>
+      <w:pPr>
+        <w:pStyle w:val="ListBullet"/>
+      </w:pPr>
+      <w:r>
+        <w:t>Khớp đúng tên luôn thắng các yếu tố khác. Cá nhân hoá chỉ xếp lại thứ tự bên trong nhóm sản phẩm đã liên quan, không đưa sản phẩm không liên quan lên đầu và không vượt qua bộ lọc.</w:t>
+      </w:r>
+    </w:p>
+    <w:p>
+      <w:pPr>
+        <w:pStyle w:val="ListBullet"/>
+      </w:pPr>
+      <w:r>
+        <w:t>Tìm kiếm khác gợi ý sản phẩm ở chỗ: không loại các sản phẩm khách đã từng xem/mua khỏi kết quả — vì khách tìm kiếm thường muốn tìm lại đúng thứ đã từng thấy.</w:t>
+      </w:r>
+    </w:p>
+    <w:p>
+      <w:pPr>
+        <w:pStyle w:val="Heading2"/>
+      </w:pPr>
+      <w:r>
+        <w:t>4. Tránh trả kết quả linh tinh cho từ khoá vô nghĩa</w:t>
+      </w:r>
+    </w:p>
+    <w:p>
+      <w:pPr/>
+      <w:r>
+        <w:t>Đặt ra một "ngưỡng tin cậy": nếu AI không đủ chắc chắn có sản phẩm nào thật sự liên quan tới từ khoá, hệ thống sẽ bỏ qua phần gợi ý của AI, chỉ dùng kết quả khớp tên (nếu có) hoặc báo "không tìm thấy".</w:t>
+      </w:r>
+    </w:p>
+    <w:p>
+      <w:pPr/>
+      <w:r>
+        <w:t>Đã kiểm tra trên toàn bộ catalog thật (236 sản phẩm) với 15 từ khoá có nhu cầu thật và 5 từ khoá vô nghĩa: hệ thống phân biệt đúng 100% cả hai nhóm, không chặn nhầm từ khoá thật nào và không để lọt từ khoá vô nghĩa nào.</w:t>
+      </w:r>
+    </w:p>
+    <w:p>
+      <w:pPr/>
+      <w:r>
+        <w:t>Hạn chế đã biết: nếu khách tìm loại hàng cửa hàng hoàn toàn không bán, hệ thống vẫn có thể trả về sản phẩm "gần giống nhất" — đây là giới hạn tự nhiên của cách tiếp cận này, không thể sửa chỉ bằng cách chỉnh ngưỡng.</w:t>
+      </w:r>
+    </w:p>
+    <w:p>
+      <w:pPr>
+        <w:pStyle w:val="Heading2"/>
+      </w:pPr>
+      <w:r>
+        <w:t>5. Không bao giờ để trang tìm kiếm bị lỗi vì AI</w:t>
       </w:r>
     </w:p>
     <w:tbl>
       <w:tblPr>
+        <w:tblStyle w:val="LightGrid-Accent1"/>
         <w:tblW w:type="auto" w:w="0"/>
         <w:tblLook w:firstColumn="1" w:firstRow="1" w:lastColumn="0" w:lastRow="0" w:noHBand="0" w:noVBand="1" w:val="04A0"/>
       </w:tblPr>
       <w:tblGrid>
-        <w:gridCol w:w="8640"/>
+        <w:gridCol w:w="4320"/>
+        <w:gridCol w:w="4320"/>
       </w:tblGrid>
       <w:tr>
         <w:tc>
           <w:tcPr>
-            <w:tcW w:type="dxa" w:w="8640"/>
-            <w:shd w:val="clear" w:fill="F3F6F4"/>
-            <w:tcBorders>
-              <w:top w:val="single" w:sz="4" w:space="0" w:color="C7D3CB"/>
-              <w:left w:val="single" w:sz="4" w:space="0" w:color="C7D3CB"/>
-              <w:bottom w:val="single" w:sz="4" w:space="0" w:color="C7D3CB"/>
-              <w:right w:val="single" w:sz="4" w:space="0" w:color="C7D3CB"/>
-            </w:tcBorders>
+            <w:tcW w:type="dxa" w:w="4320"/>
           </w:tcPr>
           <w:p>
             <w:r>
-              <w:rPr>
-                <w:rFonts w:ascii="Consolas" w:hAnsi="Consolas"/>
-                <w:color w:val="2A3831"/>
-                <w:sz w:val="18"/>
-              </w:rPr>
-              <w:t>score(p) = w_lex·lex(p) + w_sem·sem_norm(p) + w_personal·personal_norm(p) + w_pop·pop_norm(p)</w:t>
+              <w:t>Tình huống</w:t>
             </w:r>
+          </w:p>
+        </w:tc>
+        <w:tc>
+          <w:tcPr>
+            <w:tcW w:type="dxa" w:w="4320"/>
+          </w:tcPr>
+          <w:p>
             <w:r>
-              <w:rPr>
-                <w:rFonts w:ascii="Consolas" w:hAnsi="Consolas"/>
-                <w:color w:val="2A3831"/>
-                <w:sz w:val="18"/>
-              </w:rPr>
+              <w:t>Hệ thống xử lý thế nào</w:t>
             </w:r>
+          </w:p>
+        </w:tc>
+      </w:tr>
+      <w:tr>
+        <w:tc>
+          <w:tcPr>
+            <w:tcW w:type="dxa" w:w="4320"/>
+          </w:tcPr>
+          <w:p>
             <w:r>
-              <w:rPr>
-                <w:rFonts w:ascii="Consolas" w:hAnsi="Consolas"/>
-                <w:color w:val="2A3831"/>
-                <w:sz w:val="18"/>
-              </w:rPr>
-              <w:t>lex(p)      : 0 nếu p ∉ lexical_ids; ngược lại lexical_score() ∈ [1.0, 1.2]</w:t>
+              <w:t>AI gặp trục trặc nhẹ</w:t>
             </w:r>
+          </w:p>
+        </w:tc>
+        <w:tc>
+          <w:tcPr>
+            <w:tcW w:type="dxa" w:w="4320"/>
+          </w:tcPr>
+          <w:p>
             <w:r>
-              <w:rPr>
-                <w:rFonts w:ascii="Consolas" w:hAnsi="Consolas"/>
-                <w:color w:val="2A3831"/>
-                <w:sz w:val="18"/>
-              </w:rPr>
-              <w:t xml:space="preserve">              (đủ mọi token = 1.0, + 0.2 nếu khớp nguyên cụm)</w:t>
+              <w:t>Tự chuyển sang cách xử lý đơn giản hơn — khách không nhận ra gì khác.</w:t>
             </w:r>
+          </w:p>
+        </w:tc>
+      </w:tr>
+      <w:tr>
+        <w:tc>
+          <w:tcPr>
+            <w:tcW w:type="dxa" w:w="4320"/>
+          </w:tcPr>
+          <w:p>
             <w:r>
-              <w:rPr>
-                <w:rFonts w:ascii="Consolas" w:hAnsi="Consolas"/>
-                <w:color w:val="2A3831"/>
-                <w:sz w:val="18"/>
-              </w:rPr>
-              <w:t>sem(p)      : cosine(encode_query(q), emb[p]) — chỉ nhận nếu ≥ search_sem_min_sim</w:t>
+              <w:t>Dịch vụ AI ngừng hoạt động hoặc quá chậm</w:t>
             </w:r>
+          </w:p>
+        </w:tc>
+        <w:tc>
+          <w:tcPr>
+            <w:tcW w:type="dxa" w:w="4320"/>
+          </w:tcPr>
+          <w:p>
             <w:r>
-              <w:rPr>
-                <w:rFonts w:ascii="Consolas" w:hAnsi="Consolas"/>
-                <w:color w:val="2A3831"/>
-                <w:sz w:val="18"/>
-              </w:rPr>
-              <w:t xml:space="preserve">              VÀ top-1 toàn cục ≥ search_sem_top1_gate; chuẩn hoá min-max trong tập ứng viên</w:t>
+              <w:t>Tự động quay về cách tìm kiếm khớp tên như trước khi nâng cấp.</w:t>
             </w:r>
+          </w:p>
+        </w:tc>
+      </w:tr>
+      <w:tr>
+        <w:tc>
+          <w:tcPr>
+            <w:tcW w:type="dxa" w:w="4320"/>
+          </w:tcPr>
+          <w:p>
             <w:r>
-              <w:rPr>
-                <w:rFonts w:ascii="Consolas" w:hAnsi="Consolas"/>
-                <w:color w:val="2A3831"/>
-                <w:sz w:val="18"/>
-              </w:rPr>
-              <w:t>personal(p) : _profile_scores(...)[p] — tái dùng NGUYÊN TRẠNG app/main.py (~dòng 151-176),</w:t>
+              <w:t>Từ khoá không khớp gì cả</w:t>
             </w:r>
+          </w:p>
+        </w:tc>
+        <w:tc>
+          <w:tcPr>
+            <w:tcW w:type="dxa" w:w="4320"/>
+          </w:tcPr>
+          <w:p>
             <w:r>
-              <w:rPr>
-                <w:rFonts w:ascii="Consolas" w:hAnsi="Consolas"/>
-                <w:color w:val="2A3831"/>
-                <w:sz w:val="18"/>
-              </w:rPr>
-              <w:t xml:space="preserve">              chạy cho cả user đăng nhập lẫn guest session; ngoài dict → 0</w:t>
+              <w:t>Báo rõ "không tìm thấy sản phẩm", không cố gợi ý bừa.</w:t>
             </w:r>
+          </w:p>
+        </w:tc>
+      </w:tr>
+      <w:tr>
+        <w:tc>
+          <w:tcPr>
+            <w:tcW w:type="dxa" w:w="4320"/>
+          </w:tcPr>
+          <w:p>
             <w:r>
-              <w:rPr>
-                <w:rFonts w:ascii="Consolas" w:hAnsi="Consolas"/>
-                <w:color w:val="2A3831"/>
-                <w:sz w:val="18"/>
-              </w:rPr>
-              <w:t>pop(p)      : tra art.popularity; chuẩn hoá trong tập ứng viên</w:t>
+              <w:t>Giao diện gọi API mới bị lỗi</w:t>
             </w:r>
+          </w:p>
+        </w:tc>
+        <w:tc>
+          <w:tcPr>
+            <w:tcW w:type="dxa" w:w="4320"/>
+          </w:tcPr>
+          <w:p>
             <w:r>
-              <w:rPr>
-                <w:rFonts w:ascii="Consolas" w:hAnsi="Consolas"/>
-                <w:color w:val="2A3831"/>
-                <w:sz w:val="18"/>
-              </w:rPr>
+              <w:t>Tự động gọi lại API tìm kiếm cũ, khách không thấy gián đoạn.</w:t>
             </w:r>
+          </w:p>
+        </w:tc>
+      </w:tr>
+      <w:tr>
+        <w:tc>
+          <w:tcPr>
+            <w:tcW w:type="dxa" w:w="4320"/>
+          </w:tcPr>
+          <w:p>
             <w:r>
-              <w:rPr>
-                <w:rFonts w:ascii="Consolas" w:hAnsi="Consolas"/>
-                <w:color w:val="2A3831"/>
-                <w:sz w:val="18"/>
-              </w:rPr>
-              <w:t>Trọng số khởi điểm (override qua .env):</w:t>
+              <w:t>Khách chọn sắp xếp theo giá/đánh giá</w:t>
             </w:r>
+          </w:p>
+        </w:tc>
+        <w:tc>
+          <w:tcPr>
+            <w:tcW w:type="dxa" w:w="4320"/>
+          </w:tcPr>
+          <w:p>
             <w:r>
-              <w:rPr>
-                <w:rFonts w:ascii="Consolas" w:hAnsi="Consolas"/>
-                <w:color w:val="2A3831"/>
-                <w:sz w:val="18"/>
-              </w:rPr>
-              <w:t>w_search_lexical=1.0 &gt; w_search_semantic=0.8 &gt; w_search_personal=0.5 &gt; w_search_popularity=0.15</w:t>
+              <w:t>Vẫn áp dụng đúng trong nhóm kết quả đã xác định là liên quan.</w:t>
             </w:r>
           </w:p>
         </w:tc>
@@ -672,11 +710,37 @@
     </w:tbl>
     <w:p/>
     <w:p>
+      <w:pPr/>
+      <w:r>
+        <w:t>Về tốc độ: đã đo thực tế toàn bộ quy trình, luôn nằm trong giới hạn thời gian chờ cho phép (2,5 giây) — với quy mô sản phẩm hiện tại, việc xếp hạng bằng AI chỉ tốn thêm vài chục mili-giây so với tìm kiếm cũ.</w:t>
+      </w:r>
+    </w:p>
+    <w:p>
       <w:pPr>
-        <w:pStyle w:val="ListBullet"/>
+        <w:pStyle w:val="Heading1"/>
       </w:pPr>
       <w:r>
-        <w:t>Triết lý trọng số: người gõ đúng tên sản phẩm phải thấy đúng nó đứng #1 (w_lex &gt; w_sem); cá nhân hoá đủ mạnh để kéo sản phẩm hợp gu lên đầu TRONG nhóm liên quan nhưng không lật item khớp tên; phổ biến chỉ là tie-breaker.</w:t>
+        <w:t>PHẦN III — 3 GIAI ĐOẠN TRIỂN KHAI</w:t>
+      </w:r>
+    </w:p>
+    <w:p>
+      <w:pPr>
+        <w:pStyle w:val="Heading2"/>
+      </w:pPr>
+      <w:r>
+        <w:t>Giai đoạn A — Xây nền tảng AI (đã hoàn thành 11/07/2026)</w:t>
+      </w:r>
+    </w:p>
+    <w:p>
+      <w:pPr/>
+      <w:r>
+        <w:t>Mục tiêu: xây phần "bộ não" AI phía sau, chưa ai nhìn thấy trên giao diện — an toàn tuyệt đối, không ảnh hưởng người dùng đang dùng hệ thống.</w:t>
+      </w:r>
+    </w:p>
+    <w:p>
+      <w:pPr/>
+      <w:r>
+        <w:t>Kết quả: đã hoàn thành và kiểm thử đầy đủ. Toàn bộ 15 bài kiểm tra tự động đều đạt. Kiểm tra trên dữ liệu thật (236 sản phẩm): tìm "đồ sấy" trả về đúng 10/10 sản phẩm trái cây sấy; từ khoá vô nghĩa bị nhận diện và loại bỏ đúng; sản phẩm nằm ngoài bộ lọc không bao giờ lọt vào kết quả.</w:t>
       </w:r>
     </w:p>
     <w:p>
@@ -684,7 +748,7 @@
         <w:pStyle w:val="ListBullet"/>
       </w:pPr>
       <w:r>
-        <w:t>Search KHÔNG exclude seen — khác recommendation: người tìm kiếm muốn tìm lại cả thứ đã xem/mua. Khi tái dùng _profile_scores, bỏ qua giá trị seen trả về.</w:t>
+        <w:t>Bài học quan trọng: mọi thư viện AI mới đều được thử cài đặt trước trên máy thật — tránh lặp lại sự cố từng gặp với 1 thư viện khác không cài được trên Windows.</w:t>
       </w:r>
     </w:p>
     <w:p>
@@ -692,7 +756,7 @@
         <w:pStyle w:val="ListBullet"/>
       </w:pPr>
       <w:r>
-        <w:t>Chuẩn hoá min-max trong phạm vi tập ứng viên, tái dùng _normalize của app/blend.py.</w:t>
+        <w:t>Mô tả sản phẩm đưa cho AI phải kèm cả tên danh mục, không chỉ tên sản phẩm — nếu chỉ có tên trần, AI xếp hạng sai (VD "mít sấy" từng bị xếp thấp hơn "nước rửa chén" khi tìm "đồ sấy khô").</w:t>
       </w:r>
     </w:p>
     <w:p>
@@ -700,13 +764,103 @@
         <w:pStyle w:val="Heading2"/>
       </w:pPr>
       <w:r>
-        <w:t>4. Ngưỡng chống query vô nghĩa</w:t>
+        <w:t>Giai đoạn B — Kết nối vào hệ thống thật (đã hoàn thành 11/07/2026)</w:t>
       </w:r>
     </w:p>
     <w:p>
       <w:pPr/>
       <w:r>
-        <w:t>Cosine của E5 dồn cụm cao (0.7–0.95 kể cả cặp không liên quan) nên không dùng 1 ngưỡng tuyệt đối đơn độc. Cơ chế 2 tầng, đều config qua .env:</w:t>
+        <w:t>Mục tiêu: khách thật gõ "đồ ăn ngon" phải ra kết quả; kết quả mặc định xếp theo mức độ liên quan có cá nhân hoá; nếu AI ngừng hoạt động, tìm kiếm vẫn chạy bình thường.</w:t>
+      </w:r>
+    </w:p>
+    <w:p>
+      <w:pPr/>
+      <w:r>
+        <w:t>Kết quả: đã hoàn thành và kiểm thử đầy đủ, cả kiểm tra tự động lẫn thao tác thực tế trên trình duyệt (9 kịch bản, đều đạt) — bao gồm việc tắt hẳn dịch vụ AI để kiểm tra tìm kiếm vẫn hoạt động bình thường (chuyển sang cách cũ trong chưa tới 50 mili-giây, tự khôi phục khi AI bật lại, không cần khởi động lại hệ thống chính).</w:t>
+      </w:r>
+    </w:p>
+    <w:p>
+      <w:pPr>
+        <w:pStyle w:val="ListBullet"/>
+      </w:pPr>
+      <w:r>
+        <w:t>Phát hiện và đã sửa 1 lỗi có sẵn từ trước, không liên quan tính năng mới: trang bị lỗi khi tính khoảng giá cho từ khoá không khớp sản phẩm nào theo tên — trước đây không ai gặp vì các từ khoá kiểu này luôn trả 0 kết quả nên không ai đi tới đoạn code đó.</w:t>
+      </w:r>
+    </w:p>
+    <w:p>
+      <w:pPr>
+        <w:pStyle w:val="ListBullet"/>
+      </w:pPr>
+      <w:r>
+        <w:t>Hạn chế đã biết: từ khoá gõ KHÔNG dấu (VD "sua tuoi") chưa được AI hiểu tốt bằng bản có dấu — đã ghi nhận để xử lý ở giai đoạn sau.</w:t>
+      </w:r>
+    </w:p>
+    <w:p>
+      <w:pPr>
+        <w:pStyle w:val="Heading2"/>
+      </w:pPr>
+      <w:r>
+        <w:t>Giai đoạn C — Đo lường &amp; cải thiện (đã hoàn thành 11/07/2026)</w:t>
+      </w:r>
+    </w:p>
+    <w:p>
+      <w:pPr/>
+      <w:r>
+        <w:t>Mục tiêu: biết được tính năng mới có thực sự tốt hơn không, gợi ý thêm từ khoá cho khách, và xử lý luôn hạn chế "từ khoá không dấu" ở Giai đoạn B.</w:t>
+      </w:r>
+    </w:p>
+    <w:p>
+      <w:pPr/>
+      <w:r>
+        <w:t>Kết quả: đã hoàn thành và kiểm thử đầy đủ.</w:t>
+      </w:r>
+    </w:p>
+    <w:p>
+      <w:pPr>
+        <w:pStyle w:val="ListBullet"/>
+      </w:pPr>
+      <w:r>
+        <w:t>Thêm 1 khu vực "Chất lượng tìm kiếm" vào trang thống kê dành cho quản trị viên: số lượt tìm kiếm, tỉ lệ 0 kết quả, và đặc biệt là "số lượt AI cứu được" — tức các lượt tìm kiếm mà cách cũ chắc chắn trả 0 kết quả nhưng AI vẫn tìm ra sản phẩm phù hợp.</w:t>
+      </w:r>
+    </w:p>
+    <w:p>
+      <w:pPr>
+        <w:pStyle w:val="ListBullet"/>
+      </w:pPr>
+      <w:r>
+        <w:t>Thêm gợi ý "Mọi người cũng tìm" ngay khi khách đang gõ, lấy từ lịch sử tìm kiếm thật của cộng đồng.</w:t>
+      </w:r>
+    </w:p>
+    <w:p>
+      <w:pPr>
+        <w:pStyle w:val="ListBullet"/>
+      </w:pPr>
+      <w:r>
+        <w:t>Đã xử lý luôn hạn chế "từ khoá không dấu": hệ thống tự tra trong lịch sử xem có ai từng gõ CÙNG từ khoá đó NHƯNG CÓ DẤU và tìm ra kết quả tốt không, nếu có thì dùng bản có dấu để AI xử lý. Kết quả: "sua tuoi" trước đây chỉ ra 12 sản phẩm, giờ ra đủ 100 sản phẩm giống hệt khi gõ có dấu.</w:t>
+      </w:r>
+    </w:p>
+    <w:p>
+      <w:pPr>
+        <w:pStyle w:val="ListBullet"/>
+      </w:pPr>
+      <w:r>
+        <w:t>Bài học mới phát hiện khi kiểm thử: việc so sánh chữ có dấu và không dấu trong cơ sở dữ liệu (MySQL) mặc định coi chúng là GIỐNG NHAU — khiến 1 đoạn logic ban đầu tưởng đúng nhưng thực ra luôn âm thầm trả về rỗng. Đã sửa bằng cách so sánh chính xác từng ký tự thay vì so sánh mặc định.</w:t>
+      </w:r>
+    </w:p>
+    <w:p>
+      <w:pPr>
+        <w:pStyle w:val="Heading1"/>
+      </w:pPr>
+      <w:r>
+        <w:t>PHẦN IV — DANH MỤC FILE &amp; CẤU HÌNH (tham chiếu cho lập trình viên)</w:t>
+      </w:r>
+    </w:p>
+    <w:p>
+      <w:pPr>
+        <w:pStyle w:val="Heading2"/>
+      </w:pPr>
+      <w:r>
+        <w:t>1. Danh mục file đã tạo/sửa theo từng phần hệ thống</w:t>
       </w:r>
     </w:p>
     <w:tbl>
@@ -727,1193 +881,7 @@
           </w:tcPr>
           <w:p>
             <w:r>
-              <w:t>Config</w:t>
-            </w:r>
-          </w:p>
-        </w:tc>
-        <w:tc>
-          <w:tcPr>
-            <w:tcW w:type="dxa" w:w="2880"/>
-          </w:tcPr>
-          <w:p>
-            <w:r>
-              <w:t>Khởi điểm</w:t>
-            </w:r>
-          </w:p>
-        </w:tc>
-        <w:tc>
-          <w:tcPr>
-            <w:tcW w:type="dxa" w:w="2880"/>
-          </w:tcPr>
-          <w:p>
-            <w:r>
-              <w:t>Vai trò</w:t>
-            </w:r>
-          </w:p>
-        </w:tc>
-      </w:tr>
-      <w:tr>
-        <w:tc>
-          <w:tcPr>
-            <w:tcW w:type="dxa" w:w="2880"/>
-          </w:tcPr>
-          <w:p>
-            <w:r>
-              <w:t>search_sem_top1_gate</w:t>
-            </w:r>
-          </w:p>
-        </w:tc>
-        <w:tc>
-          <w:tcPr>
-            <w:tcW w:type="dxa" w:w="2880"/>
-          </w:tcPr>
-          <w:p>
-            <w:r>
-              <w:t>0.82</w:t>
-            </w:r>
-          </w:p>
-        </w:tc>
-        <w:tc>
-          <w:tcPr>
-            <w:tcW w:type="dxa" w:w="2880"/>
-          </w:tcPr>
-          <w:p>
-            <w:r>
-              <w:t>Top-1 semantic trong allowed_ids &lt; gate → semantic coi như KHÔNG có tín hiệu cho query này (query rác); nếu lexical cũng rỗng → matched=false, FE hiện empty-state</w:t>
-            </w:r>
-          </w:p>
-        </w:tc>
-      </w:tr>
-      <w:tr>
-        <w:tc>
-          <w:tcPr>
-            <w:tcW w:type="dxa" w:w="2880"/>
-          </w:tcPr>
-          <w:p>
-            <w:r>
-              <w:t>search_sem_min_sim</w:t>
-            </w:r>
-          </w:p>
-        </w:tc>
-        <w:tc>
-          <w:tcPr>
-            <w:tcW w:type="dxa" w:w="2880"/>
-          </w:tcPr>
-          <w:p>
-            <w:r>
-              <w:t>0.80</w:t>
-            </w:r>
-          </w:p>
-        </w:tc>
-        <w:tc>
-          <w:tcPr>
-            <w:tcW w:type="dxa" w:w="2880"/>
-          </w:tcPr>
-          <w:p>
-            <w:r>
-              <w:t>Sàn tuyệt đối cho từng ứng viên lọt qua nhánh semantic (nâng từ 0.78 sau calibrate: vùng 0.78-0.81 là dải điểm của query rác)</w:t>
-            </w:r>
-          </w:p>
-        </w:tc>
-      </w:tr>
-      <w:tr>
-        <w:tc>
-          <w:tcPr>
-            <w:tcW w:type="dxa" w:w="2880"/>
-          </w:tcPr>
-          <w:p>
-            <w:r>
-              <w:t>search_sem_top_k</w:t>
-            </w:r>
-          </w:p>
-        </w:tc>
-        <w:tc>
-          <w:tcPr>
-            <w:tcW w:type="dxa" w:w="2880"/>
-          </w:tcPr>
-          <w:p>
-            <w:r>
-              <w:t>100</w:t>
-            </w:r>
-          </w:p>
-        </w:tc>
-        <w:tc>
-          <w:tcPr>
-            <w:tcW w:type="dxa" w:w="2880"/>
-          </w:tcPr>
-          <w:p>
-            <w:r>
-              <w:t>Chặn đuôi số ứng viên semantic</w:t>
-            </w:r>
-          </w:p>
-        </w:tc>
-      </w:tr>
-      <w:tr>
-        <w:tc>
-          <w:tcPr>
-            <w:tcW w:type="dxa" w:w="2880"/>
-          </w:tcPr>
-          <w:p>
-            <w:r>
-              <w:t>search_tfidf_min_sim</w:t>
-            </w:r>
-          </w:p>
-        </w:tc>
-        <w:tc>
-          <w:tcPr>
-            <w:tcW w:type="dxa" w:w="2880"/>
-          </w:tcPr>
-          <w:p>
-            <w:r>
-              <w:t>0.05</w:t>
-            </w:r>
-          </w:p>
-        </w:tc>
-        <w:tc>
-          <w:tcPr>
-            <w:tcW w:type="dxa" w:w="2880"/>
-          </w:tcPr>
-          <w:p>
-            <w:r>
-              <w:t>Bộ ngưỡng riêng khi backend=tfidf (thang điểm khác hẳn)</w:t>
-            </w:r>
-          </w:p>
-        </w:tc>
-      </w:tr>
-    </w:tbl>
-    <w:p/>
-    <w:p>
-      <w:pPr/>
-      <w:r>
-        <w:t>ĐÃ calibrate trên catalog thật 236 sản phẩm (scripts/calibrate_search.py, 11/07/2026): top-1 của 15 query nhu cầu thật nằm trong 0.836–0.894, của 5 query rác 0.785–0.809 — khoảng tách rõ, gate 0.82 nằm chính giữa (chặn nhầm 0/15 query thật, lọt 0/5 query rác). Sàn min_sim nâng 0.78 → 0.80 vì vùng 0.78–0.81 chính là dải điểm của query rác. Chất lượng định tính: "đồ sấy" ra đúng 10/10 Trái cây sấy, "gia vị nấu ăn"/"đồ uống giải khát" đúng nhóm. Hạn chế đã biết: query về ngành hàng catalog KHÔNG bán (VD "đồ tẩy rửa" trên catalog thuần thực phẩm) vẫn vượt gate với kết quả gần nghĩa nhất — gate không sửa được việc "cửa hàng không bán thứ đó". Khi catalog đổi lớn, chạy lại script calibrate rồi chỉnh .env.</w:t>
-      </w:r>
-    </w:p>
-    <w:p>
-      <w:pPr>
-        <w:pStyle w:val="Heading2"/>
-      </w:pPr>
-      <w:r>
-        <w:t>5. Chuỗi fallback 3 tầng</w:t>
-      </w:r>
-    </w:p>
-    <w:tbl>
-      <w:tblPr>
-        <w:tblStyle w:val="LightGrid-Accent1"/>
-        <w:tblW w:type="auto" w:w="0"/>
-        <w:tblLook w:firstColumn="1" w:firstRow="1" w:lastColumn="0" w:lastRow="0" w:noHBand="0" w:noVBand="1" w:val="04A0"/>
-      </w:tblPr>
-      <w:tblGrid>
-        <w:gridCol w:w="4320"/>
-        <w:gridCol w:w="4320"/>
-      </w:tblGrid>
-      <w:tr>
-        <w:tc>
-          <w:tcPr>
-            <w:tcW w:type="dxa" w:w="4320"/>
-          </w:tcPr>
-          <w:p>
-            <w:r>
-              <w:t>Sự cố</w:t>
-            </w:r>
-          </w:p>
-        </w:tc>
-        <w:tc>
-          <w:tcPr>
-            <w:tcW w:type="dxa" w:w="4320"/>
-          </w:tcPr>
-          <w:p>
-            <w:r>
-              <w:t>Hành vi</w:t>
-            </w:r>
-          </w:p>
-        </w:tc>
-      </w:tr>
-      <w:tr>
-        <w:tc>
-          <w:tcPr>
-            <w:tcW w:type="dxa" w:w="4320"/>
-          </w:tcPr>
-          <w:p>
-            <w:r>
-              <w:t>Encoder hỏng / model chưa tải</w:t>
-            </w:r>
-          </w:p>
-        </w:tc>
-        <w:tc>
-          <w:tcPr>
-            <w:tcW w:type="dxa" w:w="4320"/>
-          </w:tcPr>
-          <w:p>
-            <w:r>
-              <w:t>Python tự hạ bậc backend (torch → tfidf → off), service vẫn lên; /search/rank vẫn phục vụ lexical + personal + popularity, algorithm_source=LEXICAL_ONLY</w:t>
-            </w:r>
-          </w:p>
-        </w:tc>
-      </w:tr>
-      <w:tr>
-        <w:tc>
-          <w:tcPr>
-            <w:tcW w:type="dxa" w:w="4320"/>
-          </w:tcPr>
-          <w:p>
-            <w:r>
-              <w:t>Encode catalog lỗi giữa retrain</w:t>
-            </w:r>
-          </w:p>
-        </w:tc>
-        <w:tc>
-          <w:tcPr>
-            <w:tcW w:type="dxa" w:w="4320"/>
-          </w:tcPr>
-          <w:p>
-            <w:r>
-              <w:t>Giữ emb_matrix cũ (carry-forward như CF), các artifact khác không ảnh hưởng</w:t>
-            </w:r>
-          </w:p>
-        </w:tc>
-      </w:tr>
-      <w:tr>
-        <w:tc>
-          <w:tcPr>
-            <w:tcW w:type="dxa" w:w="4320"/>
-          </w:tcPr>
-          <w:p>
-            <w:r>
-              <w:t>Python chết / timeout / 500 / rỗng bất thường</w:t>
-            </w:r>
-          </w:p>
-        </w:tc>
-        <w:tc>
-          <w:tcPr>
-            <w:tcW w:type="dxa" w:w="4320"/>
-          </w:tcPr>
-          <w:p>
-            <w:r>
-              <w:t>Java searchMode=LEXICAL_FALLBACK — kết quả y hệt hôm nay, cắt ở 2.5s</w:t>
-            </w:r>
-          </w:p>
-        </w:tc>
-      </w:tr>
-      <w:tr>
-        <w:tc>
-          <w:tcPr>
-            <w:tcW w:type="dxa" w:w="4320"/>
-          </w:tcPr>
-          <w:p>
-            <w:r>
-              <w:t>matched=false (query rác, lexical cũng rỗng)</w:t>
-            </w:r>
-          </w:p>
-        </w:tc>
-        <w:tc>
-          <w:tcPr>
-            <w:tcW w:type="dxa" w:w="4320"/>
-          </w:tcPr>
-          <w:p>
-            <w:r>
-              <w:t>Java trả trang rỗng NO_MATCH — KHÔNG gọi lại LIKE (lexical_ids đã rỗng từ DB, gọi lại chỉ phí)</w:t>
-            </w:r>
-          </w:p>
-        </w:tc>
-      </w:tr>
-      <w:tr>
-        <w:tc>
-          <w:tcPr>
-            <w:tcW w:type="dxa" w:w="4320"/>
-          </w:tcPr>
-          <w:p>
-            <w:r>
-              <w:t>Endpoint smart-search 5xx / kill-switch off / lỗi mạng</w:t>
-            </w:r>
-          </w:p>
-        </w:tc>
-        <w:tc>
-          <w:tcPr>
-            <w:tcW w:type="dxa" w:w="4320"/>
-          </w:tcPr>
-          <w:p>
-            <w:r>
-              <w:t>FE catch → gọi lại GET products/search cũ với buildProductNameFilter</w:t>
-            </w:r>
-          </w:p>
-        </w:tc>
-      </w:tr>
-      <w:tr>
-        <w:tc>
-          <w:tcPr>
-            <w:tcW w:type="dxa" w:w="4320"/>
-          </w:tcPr>
-          <w:p>
-            <w:r>
-              <w:t>User chọn sort tường minh (giá/rating…)</w:t>
-            </w:r>
-          </w:p>
-        </w:tc>
-        <w:tc>
-          <w:tcPr>
-            <w:tcW w:type="dxa" w:w="4320"/>
-          </w:tcPr>
-          <w:p>
-            <w:r>
-              <w:t>Vẫn recall thông minh, sort DB-side trong tập matched: WHERE id IN (rankedIds) ORDER BY &lt;field&gt;</w:t>
-            </w:r>
-          </w:p>
-        </w:tc>
-      </w:tr>
-    </w:tbl>
-    <w:p/>
-    <w:p>
-      <w:pPr/>
-      <w:r>
-        <w:t>Ngân sách độ trễ thực tế: encode 1 query ONNX CPU ~10–50ms (có LRU cache 512 theo query chuẩn hoá) + cosine brute-force vài trăm sản phẩm &lt;1ms + 2–3 query hồ sơ ~10–30ms — dư dả trong budget 2.5s. Catalog nhỏ nên brute-force numpy là đủ, CHƯA cần FAISS/vector index (tránh over-engineer sớm).</w:t>
-      </w:r>
-    </w:p>
-    <w:p>
-      <w:pPr>
-        <w:pStyle w:val="Heading1"/>
-      </w:pPr>
-      <w:r>
-        <w:t>PHẦN III — PHÂN KỲ TRIỂN KHAI</w:t>
-      </w:r>
-    </w:p>
-    <w:p>
-      <w:pPr>
-        <w:pStyle w:val="Heading2"/>
-      </w:pPr>
-      <w:r>
-        <w:t>Phase A — Nền tảng semantic phía Python (chưa đụng Java/FE) — ĐÃ XONG 11/07/2026</w:t>
-      </w:r>
-    </w:p>
-    <w:p>
-      <w:pPr/>
-      <w:r>
-        <w:t>TRẠNG THÁI: đã code xong + verify đầy đủ ngày 11/07/2026. Spike PASS ngay Plan A (onnxruntime 1.27 + tokenizers + huggingface-hub đều wheel prebuilt trên Windows/py3.12/numpy2 — không lặp lại số phận implicit; model ONNX 470MB, lưu ý con số ~120MB ở Phần II là ước lượng ban đầu chưa chính xác). Pytest 15/15; calibrate trên catalog thật 236 sản phẩm (kết quả ở Phần II mục 4); E2E qua uvicorn thật đủ 5 kịch bản: semantic rescue "đồ sấy" trả đúng 10/10 Trái cây sấy (đối chiếu DB), query rác matched=false, allowed_ids không rò rỉ, lexical thắng semantic, session lạ không crash. Service KHÔNG tự tải model lúc start — máy mới chạy scripts/check_embedding_env.py 1 lần.</w:t>
-      </w:r>
-    </w:p>
-    <w:p>
-      <w:pPr/>
-      <w:r>
-        <w:t>Mục tiêu: Python service encode được catalog + query tiếng Việt, expose POST /search/rank hoàn chỉnh (semantic ∪ lexical + cá nhân hoá + phổ biến), verify bằng curl/pytest. Chưa user nào nhìn thấy — zero rủi ro UX. Không có ngưỡng dữ liệu (semantic không cần interaction).</w:t>
-      </w:r>
-    </w:p>
-    <w:p>
-      <w:pPr>
-        <w:pStyle w:val="Heading3"/>
-      </w:pPr>
-      <w:r>
-        <w:t>A.1. Tiên quyết: spike cài đặt PASS trước khi viết code chính</w:t>
-      </w:r>
-    </w:p>
-    <w:p>
-      <w:pPr>
-        <w:pStyle w:val="ListBullet"/>
-      </w:pPr>
-      <w:r>
-        <w:t>scripts/check_embedding_env.py: cài thử onnxruntime + tokenizers + huggingface-hub vào venv, tải model về data/models/multilingual-e5-small/, encode 3 câu tiếng Việt, in cosine "đồ sấy khô" vs "mít sấy giòn" vs "nước rửa chén". Pass mới commit requirements.</w:t>
-      </w:r>
-    </w:p>
-    <w:p>
-      <w:pPr>
-        <w:pStyle w:val="ListBullet"/>
-      </w:pPr>
-      <w:r>
-        <w:t>Fail → thử Plan B (torch CPU); fail nữa → chốt Plan C (TF-IDF) và ghi rõ vào README.</w:t>
-      </w:r>
-    </w:p>
-    <w:p>
-      <w:pPr>
-        <w:pStyle w:val="Heading3"/>
-      </w:pPr>
-      <w:r>
-        <w:t>A.2. File mới — package app/search/</w:t>
-      </w:r>
-    </w:p>
-    <w:tbl>
-      <w:tblPr>
-        <w:tblStyle w:val="LightGrid-Accent1"/>
-        <w:tblW w:type="auto" w:w="0"/>
-        <w:tblLook w:firstColumn="1" w:firstRow="1" w:lastColumn="0" w:lastRow="0" w:noHBand="0" w:noVBand="1" w:val="04A0"/>
-      </w:tblPr>
-      <w:tblGrid>
-        <w:gridCol w:w="4320"/>
-        <w:gridCol w:w="4320"/>
-      </w:tblGrid>
-      <w:tr>
-        <w:tc>
-          <w:tcPr>
-            <w:tcW w:type="dxa" w:w="4320"/>
-          </w:tcPr>
-          <w:p>
-            <w:r>
-              <w:t>File</w:t>
-            </w:r>
-          </w:p>
-        </w:tc>
-        <w:tc>
-          <w:tcPr>
-            <w:tcW w:type="dxa" w:w="4320"/>
-          </w:tcPr>
-          <w:p>
-            <w:r>
-              <w:t>Nội dung chính</w:t>
-            </w:r>
-          </w:p>
-        </w:tc>
-      </w:tr>
-      <w:tr>
-        <w:tc>
-          <w:tcPr>
-            <w:tcW w:type="dxa" w:w="4320"/>
-          </w:tcPr>
-          <w:p>
-            <w:r>
-              <w:t>app/search/encoder.py</w:t>
-            </w:r>
-          </w:p>
-        </w:tc>
-        <w:tc>
-          <w:tcPr>
-            <w:tcW w:type="dxa" w:w="4320"/>
-          </w:tcPr>
-          <w:p>
-            <w:r>
-              <w:t>Singleton load 1 lần lúc process start (KHÔNG load lại mỗi retrain). encode_passages(texts) batch prefix "passage: "; encode_query(q) prefix "query: " + LRU cache 512; backend() → onnx|torch|tfidf|off, auto rơi bậc khi import/model lỗi, log WARNING rõ</w:t>
-            </w:r>
-          </w:p>
-        </w:tc>
-      </w:tr>
-      <w:tr>
-        <w:tc>
-          <w:tcPr>
-            <w:tcW w:type="dxa" w:w="4320"/>
-          </w:tcPr>
-          <w:p>
-            <w:r>
-              <w:t>app/search/lexical.py</w:t>
-            </w:r>
-          </w:p>
-        </w:tc>
-        <w:tc>
-          <w:tcPr>
-            <w:tcW w:type="dxa" w:w="4320"/>
-          </w:tcPr>
-          <w:p>
-            <w:r>
-              <w:t>Chuẩn hoá không dấu + lowercase (port stripDiacritics/normalizeKeyword); lexical_score(query_tokens, name_norm) ∈ [1.0, 1.2] — chỉ TINH CHỈNH thứ tự trong lexical_ids Java gửi sang, membership do Java quyết</w:t>
-            </w:r>
-          </w:p>
-        </w:tc>
-      </w:tr>
-      <w:tr>
-        <w:tc>
-          <w:tcPr>
-            <w:tcW w:type="dxa" w:w="4320"/>
-          </w:tcPr>
-          <w:p>
-            <w:r>
-              <w:t>app/search/embeddings.py</w:t>
-            </w:r>
-          </w:p>
-        </w:tc>
-        <w:tc>
-          <w:tcPr>
-            <w:tcW w:type="dxa" w:w="4320"/>
-          </w:tcPr>
-          <w:p>
-            <w:r>
-              <w:t>build(df): document = "passage: {tên}. {category}. {description strip HTML, cắt 500 ký tự}"; cache encode theo (product_id, md5(document)) vào data/emb_cache.npz — retrain nightly chỉ encode sản phẩm mới/sửa</w:t>
-            </w:r>
-          </w:p>
-        </w:tc>
-      </w:tr>
-      <w:tr>
-        <w:tc>
-          <w:tcPr>
-            <w:tcW w:type="dxa" w:w="4320"/>
-          </w:tcPr>
-          <w:p>
-            <w:r>
-              <w:t>app/search/rank.py</w:t>
-            </w:r>
-          </w:p>
-        </w:tc>
-        <w:tc>
-          <w:tcPr>
-            <w:tcW w:type="dxa" w:w="4320"/>
-          </w:tcPr>
-          <w:p>
-            <w:r>
-              <w:t>rank_search(q, allowed_ids, lexical_ids, user_id, session_id, art, limit) — hợp nhất ứng viên, gate ngưỡng, blend 4 nguồn, trả ranked list</w:t>
-            </w:r>
-          </w:p>
-        </w:tc>
-      </w:tr>
-    </w:tbl>
-    <w:p/>
-    <w:p>
-      <w:pPr>
-        <w:pStyle w:val="Heading3"/>
-      </w:pPr>
-      <w:r>
-        <w:t>A.3. File sửa</w:t>
-      </w:r>
-    </w:p>
-    <w:p>
-      <w:pPr>
-        <w:pStyle w:val="ListBullet"/>
-      </w:pPr>
-      <w:r>
-        <w:t>app/store.py — ModelArtifacts thêm: emb_matrix (np [N,384] l2-normalized, hàng khớp product_ids, dùng chung pid_to_idx), name_norm (dict id → tên chuẩn hoá), tfidf_vectorizer (Plan C).</w:t>
-      </w:r>
-    </w:p>
-    <w:p>
-      <w:pPr>
-        <w:pStyle w:val="ListBullet"/>
-      </w:pPr>
-      <w:r>
-        <w:t>app/candidates/content_based.py — trả thêm vectorizer + name_norm (df đã có sẵn trong tay).</w:t>
-      </w:r>
-    </w:p>
-    <w:p>
-      <w:pPr>
-        <w:pStyle w:val="ListBullet"/>
-      </w:pPr>
-      <w:r>
-        <w:t>app/trainer.py — build embedding trong train_all(); lỗi encode → emb_matrix=None + log, KHÔNG giết các artifact khác (giống pattern _train_cf).</w:t>
-      </w:r>
-    </w:p>
-    <w:p>
-      <w:pPr>
-        <w:pStyle w:val="ListBullet"/>
-      </w:pPr>
-      <w:r>
-        <w:t>app/main.py — endpoint POST /search/rank; /health thêm search_backend, emb_products_indexed.</w:t>
-      </w:r>
-    </w:p>
-    <w:p>
-      <w:pPr>
-        <w:pStyle w:val="ListBullet"/>
-      </w:pPr>
-      <w:r>
-        <w:t>app/config.py — nhóm search_* và w_search_* (bảng ở Phần II); requirements.txt theo kết quả spike.</w:t>
-      </w:r>
-    </w:p>
-    <w:p>
-      <w:pPr>
-        <w:pStyle w:val="Heading3"/>
-      </w:pPr>
-      <w:r>
-        <w:t>A.4. API contract POST /search/rank</w:t>
-      </w:r>
-    </w:p>
-    <w:tbl>
-      <w:tblPr>
-        <w:tblW w:type="auto" w:w="0"/>
-        <w:tblLook w:firstColumn="1" w:firstRow="1" w:lastColumn="0" w:lastRow="0" w:noHBand="0" w:noVBand="1" w:val="04A0"/>
-      </w:tblPr>
-      <w:tblGrid>
-        <w:gridCol w:w="8640"/>
-      </w:tblGrid>
-      <w:tr>
-        <w:tc>
-          <w:tcPr>
-            <w:tcW w:type="dxa" w:w="8640"/>
-            <w:shd w:val="clear" w:fill="F3F6F4"/>
-            <w:tcBorders>
-              <w:top w:val="single" w:sz="4" w:space="0" w:color="C7D3CB"/>
-              <w:left w:val="single" w:sz="4" w:space="0" w:color="C7D3CB"/>
-              <w:bottom w:val="single" w:sz="4" w:space="0" w:color="C7D3CB"/>
-              <w:right w:val="single" w:sz="4" w:space="0" w:color="C7D3CB"/>
-            </w:tcBorders>
-          </w:tcPr>
-          <w:p>
-            <w:r>
-              <w:rPr>
-                <w:rFonts w:ascii="Consolas" w:hAnsi="Consolas"/>
-                <w:color w:val="2A3831"/>
-                <w:sz w:val="18"/>
-              </w:rPr>
-              <w:t>// Request</w:t>
-            </w:r>
-            <w:r>
-              <w:rPr>
-                <w:rFonts w:ascii="Consolas" w:hAnsi="Consolas"/>
-                <w:color w:val="2A3831"/>
-                <w:sz w:val="18"/>
-              </w:rPr>
-              <w:t>{ "query": "đồ ăn ngon", "allowed_ids": [1,5,9,...], "lexical_ids": [5],</w:t>
-            </w:r>
-            <w:r>
-              <w:rPr>
-                <w:rFonts w:ascii="Consolas" w:hAnsi="Consolas"/>
-                <w:color w:val="2A3831"/>
-                <w:sz w:val="18"/>
-              </w:rPr>
-              <w:t xml:space="preserve">  "user_id": 12, "session_id": "abc", "limit": 300 }</w:t>
-            </w:r>
-            <w:r>
-              <w:rPr>
-                <w:rFonts w:ascii="Consolas" w:hAnsi="Consolas"/>
-                <w:color w:val="2A3831"/>
-                <w:sz w:val="18"/>
-              </w:rPr>
-            </w:r>
-            <w:r>
-              <w:rPr>
-                <w:rFonts w:ascii="Consolas" w:hAnsi="Consolas"/>
-                <w:color w:val="2A3831"/>
-                <w:sz w:val="18"/>
-              </w:rPr>
-              <w:t>// Response 200</w:t>
-            </w:r>
-            <w:r>
-              <w:rPr>
-                <w:rFonts w:ascii="Consolas" w:hAnsi="Consolas"/>
-                <w:color w:val="2A3831"/>
-                <w:sz w:val="18"/>
-              </w:rPr>
-              <w:t>{ "request_id": "…", "model_version": "…",</w:t>
-            </w:r>
-            <w:r>
-              <w:rPr>
-                <w:rFonts w:ascii="Consolas" w:hAnsi="Consolas"/>
-                <w:color w:val="2A3831"/>
-                <w:sz w:val="18"/>
-              </w:rPr>
-              <w:t xml:space="preserve">  "algorithm_source": "SEMANTIC_HYBRID",   // TFIDF_HYBRID khi degrade, LEXICAL_ONLY khi backend off</w:t>
-            </w:r>
-            <w:r>
-              <w:rPr>
-                <w:rFonts w:ascii="Consolas" w:hAnsi="Consolas"/>
-                <w:color w:val="2A3831"/>
-                <w:sz w:val="18"/>
-              </w:rPr>
-              <w:t xml:space="preserve">  "matched": true,</w:t>
-            </w:r>
-            <w:r>
-              <w:rPr>
-                <w:rFonts w:ascii="Consolas" w:hAnsi="Consolas"/>
-                <w:color w:val="2A3831"/>
-                <w:sz w:val="18"/>
-              </w:rPr>
-              <w:t xml:space="preserve">  "items": [ { "product_id": 5, "score": 1.83, "source": "LEXICAL" } ] }</w:t>
-            </w:r>
-            <w:r>
-              <w:rPr>
-                <w:rFonts w:ascii="Consolas" w:hAnsi="Consolas"/>
-                <w:color w:val="2A3831"/>
-                <w:sz w:val="18"/>
-              </w:rPr>
-              <w:t xml:space="preserve">  // source ∈ LEXICAL | SEMANTIC | PERSONALIZED — nguồn đóng góp lớn nhất, cùng convention blend.py</w:t>
-            </w:r>
-            <w:r>
-              <w:rPr>
-                <w:rFonts w:ascii="Consolas" w:hAnsi="Consolas"/>
-                <w:color w:val="2A3831"/>
-                <w:sz w:val="18"/>
-              </w:rPr>
-              <w:t xml:space="preserve">  // matched=false, items=[] khi cả 2 nhánh rỗng; 503 khi model chưa train (Java tự fallback)</w:t>
-            </w:r>
-          </w:p>
-        </w:tc>
-      </w:tr>
-    </w:tbl>
-    <w:p/>
-    <w:p>
-      <w:pPr>
-        <w:pStyle w:val="Heading3"/>
-      </w:pPr>
-      <w:r>
-        <w:t>A.5. Verify &amp; rủi ro</w:t>
-      </w:r>
-    </w:p>
-    <w:p>
-      <w:pPr>
-        <w:pStyle w:val="ListBullet"/>
-      </w:pPr>
-      <w:r>
-        <w:t>pytest tests/test_search_rank.py: ứng viên ngoài allowed_ids không bao giờ lọt; gate chặn query rác; sanity cosine cố định (cặp gần nghĩa &gt; cặp xa nghĩa — bắt lỗi quên prefix/pooling sai); .env override trọng số có tác dụng; backend=off vẫn trả lexical.</w:t>
-      </w:r>
-    </w:p>
-    <w:p>
-      <w:pPr>
-        <w:pStyle w:val="ListBullet"/>
-      </w:pPr>
-      <w:r>
-        <w:t>scripts/calibrate_search.py: bảng top-10 + cosine cho ~20 query thật → chỉnh 2 ngưỡng.</w:t>
-      </w:r>
-    </w:p>
-    <w:p>
-      <w:pPr>
-        <w:pStyle w:val="ListBullet"/>
-      </w:pPr>
-      <w:r>
-        <w:t>Rủi ro: wheel lỗi (đã có bậc thang A/B/C); quên prefix E5 (test sanity); ngưỡng sai trên seed ít ỏi (calibrate + .env); description seed kém kéo lệch embedding → nếu calibrate thấy nhiễu, hạ description khỏi document (chỉ tên + category) — quyết định tại bước calibrate.</w:t>
-      </w:r>
-    </w:p>
-    <w:p>
-      <w:pPr>
-        <w:pStyle w:val="Heading2"/>
-      </w:pPr>
-      <w:r>
-        <w:t>Phase B — Tích hợp Java + FE: relevance mặc định, cá nhân hoá thật — ĐÃ XONG 11/07/2026</w:t>
-      </w:r>
-    </w:p>
-    <w:p>
-      <w:pPr/>
-      <w:r>
-        <w:t>TRẠNG THÁI: đã code xong + verify đầy đủ ngày 11/07/2026. E2E qua HTTP thật (Java proxy): semantic rescue "đồ sấy" total=100 nguồn SEMANTIC_HYBRID; sort giá asc đúng thứ tự trong tập matched; query rác → NO_MATCH total=0; filter category bó hẹp → 100% kết quả đúng category; phân trang trang 1 ∪ trang 2 không trùng id; kill-Python drill → LEXICAL_FALLBACK trong ~30-47ms, bật lại tự hồi phục không cần restart Java. Selenium UI thật 6 kịch bản PASS (kể cả nhãn sort mặc định "Liên quan" và trang danh mục thường không đổi hành vi).</w:t>
-      </w:r>
-    </w:p>
-    <w:p>
-      <w:pPr/>
-      <w:r>
-        <w:t>2 phát hiện trong lúc verify: (1) BUG CÓ SẴN bị Smart Search làm lộ — products/max-price trả 500 khi không có tên nào khớp LIKE (MAX(price)=NULL unbox NPE); trước đây query nhu cầu trả 0 kết quả nên FE không bao giờ gọi max-price, giờ có kết quả semantic là dính ngay, error state che cả trang. Đã sửa: COALESCE(MAX,0) phía Java + FE bỏ lọc max-price theo tên khi search (bound theo category là đủ cho slider). (2) HẠN CHẾ ĐÃ BIẾT: query KHÔNG DẤU ("sua tuoi") chỉ được nhánh lexical (12 kết quả — E5 không vượt gate với text không dấu), trong khi bản có dấu ("sữa tươi") được semantic mở rộng (100); top-10 trùng 8/10 nên trang đầu gần như nhau và vẫn không tệ hơn hiện tại — ứng viên tinh chỉnh Phase C.</w:t>
-      </w:r>
-    </w:p>
-    <w:p>
-      <w:pPr/>
-      <w:r>
-        <w:t>Mục tiêu: user thật gõ "đồ ăn ngon" ra kết quả; mặc định xếp "Liên quan" có cá nhân hoá; filter cứng giữ nguyên hiệu lực; sort tường minh hoạt động trong phạm vi recall mới; Python chết → search y như cũ. Tiên quyết: Phase A pass calibrate.</w:t>
-      </w:r>
-    </w:p>
-    <w:p>
-      <w:pPr>
-        <w:pStyle w:val="Heading3"/>
-      </w:pPr>
-      <w:r>
-        <w:t>B.1. Java</w:t>
-      </w:r>
-    </w:p>
-    <w:p>
-      <w:pPr>
-        <w:pStyle w:val="ListBullet"/>
-      </w:pPr>
-      <w:r>
-        <w:t>MỚI service/SmartSearchService.java — inject bean @Qualifier("recommendationRestTemplate") (2000/2500ms, không nới), luồng 5 bước như Sơ đồ 1; hydrate slice trang (10 id/lần) bằng findActiveDtoByIdIn giữ nguyên thứ tự (pattern hydrate của RecommendationService); userId CHỈ derive từ JWT (getCurrentUserOrNull), không nhận từ client.</w:t>
-      </w:r>
-    </w:p>
-    <w:p>
-      <w:pPr>
-        <w:pStyle w:val="ListBullet"/>
-      </w:pPr>
-      <w:r>
-        <w:t>MỚI domain/request/SmartSearchRequestDTO.java {q, sessionId}; domain/response/recommendation/PythonSearchRankResponse.java.</w:t>
-      </w:r>
-    </w:p>
-    <w:p>
-      <w:pPr>
-        <w:pStyle w:val="ListBullet"/>
-      </w:pPr>
-      <w:r>
-        <w:t>SỬA ProductController.java — POST products/smart-search?filter=&amp;page=&amp;size=&amp;sort= (body {q, sessionId}); bind @Filter Specification&lt;Product&gt; từ query param như cũ (filter chỉ ASCII).</w:t>
-      </w:r>
-    </w:p>
-    <w:p>
-      <w:pPr>
-        <w:pStyle w:val="ListBullet"/>
-      </w:pPr>
-      <w:r>
-        <w:t>SỬA ProductRepository — projection id-only theo Specification (cạnh searchProduct sẵn có).</w:t>
-      </w:r>
-    </w:p>
-    <w:p>
-      <w:pPr>
-        <w:pStyle w:val="ListBullet"/>
-      </w:pPr>
-      <w:r>
-        <w:t>SỬA SecurityConfiguration — đúng 1 rule permitAll cho ĐÚNG HttpMethod.POST + ĐÚNG path products/smart-search (bài học per-method; không wildcard mở nhầm các POST products/* của admin).</w:t>
-      </w:r>
-    </w:p>
-    <w:p>
-      <w:pPr>
-        <w:pStyle w:val="ListBullet"/>
-      </w:pPr>
-      <w:r>
-        <w:t>SỬA application.properties/yml — recommendation.search.enabled (kill-switch: off → controller đi thẳng fallback LIKE), max-candidates=2000, rank-limit=300.</w:t>
-      </w:r>
-    </w:p>
-    <w:p>
-      <w:pPr>
-        <w:pStyle w:val="ListBullet"/>
-      </w:pPr>
-      <w:r>
-        <w:t>Trả SmartSearchResultDTO = PaginationDTO (meta/result y hệt cũ — FE tái dùng toàn bộ render) + searchMode (SEMANTIC_HYBRID | TFIDF_HYBRID | LEXICAL_FALLBACK | NO_MATCH) + requestId.</w:t>
-      </w:r>
-    </w:p>
-    <w:p>
-      <w:pPr>
-        <w:pStyle w:val="Heading3"/>
-      </w:pPr>
-      <w:r>
-        <w:t>B.2. Frontend</w:t>
-      </w:r>
-    </w:p>
-    <w:p>
-      <w:pPr>
-        <w:pStyle w:val="ListBullet"/>
-      </w:pPr>
-      <w:r>
-        <w:t>apis/product.js — apiSmartSearch({q, filter, page, size, sort}); sessionId lấy từ getOrCreateSessionId() của apis/recommendation.js.</w:t>
-      </w:r>
-    </w:p>
-    <w:p>
-      <w:pPr>
-        <w:pStyle w:val="ListBullet"/>
-      </w:pPr>
-      <w:r>
-        <w:t>utils/constants.js — sortProductOption thêm option đầu {value:'', text:'Liên quan'} — mặc định khi có search term.</w:t>
-      </w:r>
-    </w:p>
-    <w:p>
-      <w:pPr>
-        <w:pStyle w:val="ListBullet"/>
-      </w:pPr>
-      <w:r>
-        <w:t>pages/guest/Product.jsx — effect fetch rẽ nhánh: có searchTerm → apiSmartSearch với filter = các mảnh hiện tại TRỪ buildProductNameFilter (active/category/promotion/rating/price giữ nguyên); catch/lỗi → chạy lại đúng nhánh cũ (fallback tầng FE). Không có searchTerm → đường cũ 100%.</w:t>
-      </w:r>
-    </w:p>
-    <w:p>
-      <w:pPr>
-        <w:pStyle w:val="ListBullet"/>
-      </w:pPr>
-      <w:r>
-        <w:t>SearchBar.jsx autocomplete GIỮ NGUYÊN LIKE — autocomplete cần &lt;100ms và match prefix tên là đúng UX; semantic để dành cho trang kết quả.</w:t>
-      </w:r>
-    </w:p>
-    <w:p>
-      <w:pPr>
-        <w:pStyle w:val="ListBullet"/>
-      </w:pPr>
-      <w:r>
-        <w:t>Known-limitation chấp nhận ở B: apiGetMaxPrice (slider giá) vẫn tính theo LIKE → khoảng giá có thể hẹp hơn tập semantic; vá ở C nếu thấy cấn.</w:t>
-      </w:r>
-    </w:p>
-    <w:p>
-      <w:pPr>
-        <w:pStyle w:val="Heading3"/>
-      </w:pPr>
-      <w:r>
-        <w:t>B.3. Verify E2E (Selenium, theo skill verify của dự án)</w:t>
-      </w:r>
-    </w:p>
-    <w:p>
-      <w:pPr>
-        <w:pStyle w:val="ListNumber"/>
-      </w:pPr>
-      <w:r>
-        <w:t>Search "đồ sấy" → ≥1 kết quả (semantic rescue; hôm nay = 0).</w:t>
-      </w:r>
-    </w:p>
-    <w:p>
-      <w:pPr>
-        <w:pStyle w:val="ListNumber"/>
-      </w:pPr>
-      <w:r>
-        <w:t>Search đúng tên 1 sản phẩm seed → sản phẩm đó đứng #1 (lexical thắng semantic).</w:t>
-      </w:r>
-    </w:p>
-    <w:p>
-      <w:pPr>
-        <w:pStyle w:val="ListNumber"/>
-      </w:pPr>
-      <w:r>
-        <w:t>Cá nhân hoá: session A xem 3 sản phẩm category X → search từ khoá chung 2 category → item X đứng trên; so sánh profile Chrome sạch thứ tự khác.</w:t>
-      </w:r>
-    </w:p>
-    <w:p>
-      <w:pPr>
-        <w:pStyle w:val="ListNumber"/>
-      </w:pPr>
-      <w:r>
-        <w:t>Filter cứng: search + tick category + kéo giá → 100% kết quả đúng category/giá.</w:t>
-      </w:r>
-    </w:p>
-    <w:p>
-      <w:pPr>
-        <w:pStyle w:val="ListNumber"/>
-      </w:pPr>
-      <w:r>
-        <w:t>Kill-Python drill: tắt uvicorn → search vẫn trả kết quả LIKE, không lỗi UI.</w:t>
-      </w:r>
-    </w:p>
-    <w:p>
-      <w:pPr>
-        <w:pStyle w:val="ListNumber"/>
-      </w:pPr>
-      <w:r>
-        <w:t>Query rác "xzqw vbnk" → empty-state "Không tìm thấy", không crash.</w:t>
-      </w:r>
-    </w:p>
-    <w:p>
-      <w:pPr>
-        <w:pStyle w:val="ListNumber"/>
-      </w:pPr>
-      <w:r>
-        <w:t>Phân trang relevance: page 1 ∪ page 2 không trùng id.</w:t>
-      </w:r>
-    </w:p>
-    <w:p>
-      <w:pPr>
-        <w:pStyle w:val="ListNumber"/>
-      </w:pPr>
-      <w:r>
-        <w:t>Sort "Giá tăng dần" khi đang search semantic → kết quả trong tập liên quan, đúng thứ tự giá.</w:t>
-      </w:r>
-    </w:p>
-    <w:p>
-      <w:pPr>
-        <w:pStyle w:val="ListNumber"/>
-      </w:pPr>
-      <w:r>
-        <w:t>Regression: "sữa" và "sua" ra cùng kết quả.</w:t>
-      </w:r>
-    </w:p>
-    <w:p>
-      <w:pPr>
-        <w:pStyle w:val="Heading3"/>
-      </w:pPr>
-      <w:r>
-        <w:t>B.4. Rủi ro</w:t>
-      </w:r>
-    </w:p>
-    <w:p>
-      <w:pPr>
-        <w:pStyle w:val="ListBullet"/>
-      </w:pPr>
-      <w:r>
-        <w:t>Mở nhầm quyền POST (đã có tiền sự) → rule per-method + test 401 các POST products/* khác.</w:t>
-      </w:r>
-    </w:p>
-    <w:p>
-      <w:pPr>
-        <w:pStyle w:val="ListBullet"/>
-      </w:pPr>
-      <w:r>
-        <w:t>@Filter binding trên POST khác biệt tinh vi → dự phòng: nhận filter string trong body, convert bằng FilterSpecificationConverter của spring-filter.</w:t>
-      </w:r>
-    </w:p>
-    <w:p>
-      <w:pPr>
-        <w:pStyle w:val="ListBullet"/>
-      </w:pPr>
-      <w:r>
-        <w:t>Test cũ assume thứ tự id → rà Selenium/TestCase liên quan search trước khi merge.</w:t>
-      </w:r>
-    </w:p>
-    <w:p>
-      <w:pPr>
-        <w:pStyle w:val="ListBullet"/>
-      </w:pPr>
-      <w:r>
-        <w:t>Personal score decay theo giờ → thứ tự "nhảy nhẹ" giữa 2 lần load: chấp nhận (drift chậm).</w:t>
-      </w:r>
-    </w:p>
-    <w:p>
-      <w:pPr>
-        <w:pStyle w:val="Heading2"/>
-      </w:pPr>
-      <w:r>
-        <w:t>Phase C — Đo lường, gợi ý từ khoá, tinh chỉnh — ĐÃ XONG 11/07/2026</w:t>
-      </w:r>
-    </w:p>
-    <w:p>
-      <w:pPr/>
-      <w:r>
-        <w:t>TRẠNG THÁI: đã code xong + verify đầy đủ ngày 11/07/2026 (cùng ngày với A/B). Đã build: (1) 3 cột mới search_logs — search_mode, clicked_position, lexical_empty (tự tạo qua ddl-auto, đều nullable nên client cũ không vỡ); (2) GET admin/search-metrics thuần Java — CTR/vị trí click theo mode, zero-result rate + top keyword 0 kết quả, semantic-rescue rate; (3) section "Chất lượng tìm kiếm" trong dashboard Gợi ý AI (2 stat + biểu đồ CTR theo mode + bảng từ khoá 0-kq + bảng chi tiết, kèm 4 popup giải thích); (4) autocomplete "Mọi người cũng tìm" trong SearchBar (chip từ khoá bản CÓ DẤU, cache Java 5 phút); (5) LÀM LUÔN tinh chỉnh query không dấu: /search/rank tự tra bản có dấu phổ biến nhất của cùng keyword_normalized trong search_logs cho nhánh semantic — "sua tuoi" từ 12 kết quả thuần lexical lên 100 kết quả semantic như bản có dấu. Verify: HTTP 5 kịch bản (tracking field mới vào DB, suggestions có dấu + loại keyword 0-kq, metrics admin, 401 không token, restore dấu) + Selenium 4 kịch bản (chip gợi ý điều hướng đúng, dashboard đủ section + popup).</w:t>
-      </w:r>
-    </w:p>
-    <w:p>
-      <w:pPr/>
-      <w:r>
-        <w:t>BÀI HỌC MỚI (dính thật khi verify): so sánh/GROUP BY chuỗi MySQL là ACCENT-INSENSITIVE ('sữa tươi' = 'sua tuoi' theo collation) — điều kiện SQL "keyword &lt;&gt; keyword_normalized" để tìm bản có dấu luôn FALSE và query trả rỗng âm thầm. Phải GROUP BY BINARY để tách biến thể rồi chọn bản có dấu ở phía ứng dụng. Cùng họ với bug dấu query param đã biết — mọi logic phân biệt có-dấu/không-dấu đều KHÔNG được dựa vào so sánh chuỗi mặc định của MySQL.</w:t>
-      </w:r>
-    </w:p>
-    <w:p>
-      <w:pPr/>
-      <w:r>
-        <w:t>Nội dung thiết kế gốc (đã triển khai đúng phạm vi, giữ lại để đối chiếu):</w:t>
-      </w:r>
-    </w:p>
-    <w:p>
-      <w:pPr/>
-      <w:r>
-        <w:t>Tiên quyết: Phase B chạy ~1–2 tuần lấy log (trên seed thì chủ động tạo traffic qua Selenium script).</w:t>
-      </w:r>
-    </w:p>
-    <w:p>
-      <w:pPr>
-        <w:pStyle w:val="Heading3"/>
-      </w:pPr>
-      <w:r>
-        <w:t>C.1. Migration + đo lường (thuần Java — số liệu phải sống kể cả khi Python chết)</w:t>
-      </w:r>
-    </w:p>
-    <w:tbl>
-      <w:tblPr>
-        <w:tblW w:type="auto" w:w="0"/>
-        <w:tblLook w:firstColumn="1" w:firstRow="1" w:lastColumn="0" w:lastRow="0" w:noHBand="0" w:noVBand="1" w:val="04A0"/>
-      </w:tblPr>
-      <w:tblGrid>
-        <w:gridCol w:w="8640"/>
-      </w:tblGrid>
-      <w:tr>
-        <w:tc>
-          <w:tcPr>
-            <w:tcW w:type="dxa" w:w="8640"/>
-            <w:shd w:val="clear" w:fill="F3F6F4"/>
-            <w:tcBorders>
-              <w:top w:val="single" w:sz="4" w:space="0" w:color="C7D3CB"/>
-              <w:left w:val="single" w:sz="4" w:space="0" w:color="C7D3CB"/>
-              <w:bottom w:val="single" w:sz="4" w:space="0" w:color="C7D3CB"/>
-              <w:right w:val="single" w:sz="4" w:space="0" w:color="C7D3CB"/>
-            </w:tcBorders>
-          </w:tcPr>
-          <w:p>
-            <w:r>
-              <w:rPr>
-                <w:rFonts w:ascii="Consolas" w:hAnsi="Consolas"/>
-                <w:color w:val="2A3831"/>
-                <w:sz w:val="18"/>
-              </w:rPr>
-              <w:t>ALTER TABLE search_logs ADD COLUMN search_mode VARCHAR(30) NULL;</w:t>
-            </w:r>
-            <w:r>
-              <w:rPr>
-                <w:rFonts w:ascii="Consolas" w:hAnsi="Consolas"/>
-                <w:color w:val="2A3831"/>
-                <w:sz w:val="18"/>
-              </w:rPr>
-              <w:t>ALTER TABLE search_logs ADD COLUMN clicked_position INT NULL;</w:t>
-            </w:r>
-            <w:r>
-              <w:rPr>
-                <w:rFonts w:ascii="Consolas" w:hAnsi="Consolas"/>
-                <w:color w:val="2A3831"/>
-                <w:sz w:val="18"/>
-              </w:rPr>
-              <w:t>-- nullable: client cũ chưa gửi field mới cũng không vỡ</w:t>
-            </w:r>
-          </w:p>
-        </w:tc>
-      </w:tr>
-    </w:tbl>
-    <w:p/>
-    <w:p>
-      <w:pPr>
-        <w:pStyle w:val="ListBullet"/>
-      </w:pPr>
-      <w:r>
-        <w:t>FE: apiTrackSearch gửi thêm searchMode từ response smart-search; handleSearchResultClick gửi vị trí item = index + (page-1)*size.</w:t>
-      </w:r>
-    </w:p>
-    <w:p>
-      <w:pPr>
-        <w:pStyle w:val="ListBullet"/>
-      </w:pPr>
-      <w:r>
-        <w:t>Endpoint admin MỚI GET admin/search-metrics?days= (rule ADMIN per-method): Search CTR theo mode (so LEXICAL_FALLBACK vs SEMANTIC_HYBRID trực tiếp); Zero-result rate + top keyword 0 kết quả (mỏ vàng nhập hàng/đặt tên lại); Semantic-rescue rate (mode semantic có kết quả trong khi lexical_ids rỗng — Java truyền cờ lexicalEmpty vào log); Avg click position theo mode.</w:t>
-      </w:r>
-    </w:p>
-    <w:p>
-      <w:pPr>
-        <w:pStyle w:val="ListBullet"/>
-      </w:pPr>
-      <w:r>
-        <w:t>FE: section "Chất lượng tìm kiếm" trong dashboard Gợi ý AI (RecommendationMetrics.jsx) — 4 stat + bảng top zero-result keywords, kèm giải thích trong recommendationMetricsExplain.jsx, hiện n (cỡ mẫu) + cảnh báo "chưa đủ dữ liệu" như pattern AB-pct.</w:t>
-      </w:r>
-    </w:p>
-    <w:p>
-      <w:pPr>
-        <w:pStyle w:val="Heading3"/>
-      </w:pPr>
-      <w:r>
-        <w:t>C.2. Autocomplete "Mọi người cũng tìm" từ SearchLog</w:t>
-      </w:r>
-    </w:p>
-    <w:p>
-      <w:pPr>
-        <w:pStyle w:val="ListBullet"/>
-      </w:pPr>
-      <w:r>
-        <w:t>Java GET products/search-suggestions?prefix=&amp;limit=8 (permitAll GET; prefix đã strip dấu client-side → match keyword_normalized ăn index idx_sl_keyword_norm — né bug dấu bằng thiết kế).</w:t>
-      </w:r>
-    </w:p>
-    <w:p>
-      <w:pPr>
-        <w:pStyle w:val="ListBullet"/>
-      </w:pPr>
-      <w:r>
-        <w:t>Query: GROUP BY keyword_normalized, HAVING COUNT(*) &gt;= 2 AND MAX(result_count) &gt; 0 — không gợi ý keyword từng 0 kết quả, không gợi ý keyword đơn lẻ (vừa chất lượng vừa tránh lộ query cá biệt của người khác); trả bản CÓ DẤU (keyword) xuất hiện nhiều nhất; cache in-memory 5 phút.</w:t>
-      </w:r>
-    </w:p>
-    <w:p>
-      <w:pPr>
-        <w:pStyle w:val="ListBullet"/>
-      </w:pPr>
-      <w:r>
-        <w:t>FE SearchBar.jsx: khối "Mọi người cũng tìm" phía trên autocomplete sản phẩm, debounce dùng chung; click → navigate /products?search=. Lỗi/rỗng → SearchBar hoạt động như cũ (catch nuốt lỗi).</w:t>
-      </w:r>
-    </w:p>
-    <w:p>
-      <w:pPr>
-        <w:pStyle w:val="Heading3"/>
-      </w:pPr>
-      <w:r>
-        <w:t>C.3. Tinh chỉnh</w:t>
-      </w:r>
-    </w:p>
-    <w:p>
-      <w:pPr>
-        <w:pStyle w:val="ListBullet"/>
-      </w:pPr>
-      <w:r>
-        <w:t>Chạy lại calibrate_search.py với top-50 keyword thật từ search_logs → chỉnh search_sem_* và w_search_* qua .env.</w:t>
-      </w:r>
-    </w:p>
-    <w:p>
-      <w:pPr>
-        <w:pStyle w:val="ListBullet"/>
-      </w:pPr>
-      <w:r>
-        <w:t>Tuỳ chọn nếu rảnh: cho chỉnh 2 trọng số từ dashboard admin qua pattern /internal/ab-config + _update_env_file sẵn có.</w:t>
-      </w:r>
-    </w:p>
-    <w:p>
-      <w:pPr>
-        <w:pStyle w:val="Heading1"/>
-      </w:pPr>
-      <w:r>
-        <w:t>PHẦN IV — DANH MỤC FILE &amp; CẤU HÌNH TỔNG HỢP</w:t>
-      </w:r>
-    </w:p>
-    <w:p>
-      <w:pPr>
-        <w:pStyle w:val="Heading2"/>
-      </w:pPr>
-      <w:r>
-        <w:t>1. Danh mục file theo tầng</w:t>
-      </w:r>
-    </w:p>
-    <w:tbl>
-      <w:tblPr>
-        <w:tblStyle w:val="LightGrid-Accent1"/>
-        <w:tblW w:type="auto" w:w="0"/>
-        <w:tblLook w:firstColumn="1" w:firstRow="1" w:lastColumn="0" w:lastRow="0" w:noHBand="0" w:noVBand="1" w:val="04A0"/>
-      </w:tblPr>
-      <w:tblGrid>
-        <w:gridCol w:w="2880"/>
-        <w:gridCol w:w="2880"/>
-        <w:gridCol w:w="2880"/>
-      </w:tblGrid>
-      <w:tr>
-        <w:tc>
-          <w:tcPr>
-            <w:tcW w:type="dxa" w:w="2880"/>
-          </w:tcPr>
-          <w:p>
-            <w:r>
-              <w:t>Tầng</w:t>
+              <w:t>Phần hệ thống</w:t>
             </w:r>
           </w:p>
         </w:tc>
@@ -1933,7 +901,7 @@
           </w:tcPr>
           <w:p>
             <w:r>
-              <w:t>File sửa</w:t>
+              <w:t>File đã sửa</w:t>
             </w:r>
           </w:p>
         </w:tc>
@@ -1997,7 +965,7 @@
           </w:tcPr>
           <w:p>
             <w:r>
-              <w:t>controller/ProductController.java; repository/ProductRepository.java; config/SecurityConfiguration.java; application.properties (Phase C: service+controller EventTracking)</w:t>
+              <w:t>controller/ProductController.java; repository/ProductRepository.java; config/SecurityConfiguration.java; application.properties; service/EventTrackingService.java</w:t>
             </w:r>
           </w:p>
         </w:tc>
@@ -2029,7 +997,7 @@
           </w:tcPr>
           <w:p>
             <w:r>
-              <w:t>apis/product.js; pages/guest/Product.jsx; utils/constants.js (Phase C: components/SearchBar.jsx; pages/admin/RecommendationMetrics.jsx; apis/recommendation.js)</w:t>
+              <w:t>apis/product.js; apis/recommendation.js; pages/guest/Product.jsx; components/common/SearchBar.jsx; pages/admin/RecommendationMetrics.jsx; utils/constants.jsx</w:t>
             </w:r>
           </w:p>
         </w:tc>
@@ -2051,7 +1019,7 @@
           </w:tcPr>
           <w:p>
             <w:r>
-              <w:t>SQL/ migration search_logs (Phase C); Selenium/TestCase bộ test smart-search</w:t>
+              <w:t>—</w:t>
             </w:r>
           </w:p>
         </w:tc>
@@ -2061,7 +1029,7 @@
           </w:tcPr>
           <w:p>
             <w:r>
-              <w:t>—</w:t>
+              <w:t>Cột mới trong bảng search_logs (tự tạo qua ddl-auto)</w:t>
             </w:r>
           </w:p>
         </w:tc>
@@ -2073,7 +1041,13 @@
         <w:pStyle w:val="Heading2"/>
       </w:pPr>
       <w:r>
-        <w:t>2. Config mới</w:t>
+        <w:t>2. Các cấu hình có thể chỉnh</w:t>
+      </w:r>
+    </w:p>
+    <w:p>
+      <w:pPr/>
+      <w:r>
+        <w:t>Toàn bộ ngưỡng và trọng số bên dưới nằm trong file cấu hình (.env), chỉnh trực tiếp không cần sửa code:</w:t>
       </w:r>
     </w:p>
     <w:tbl>
@@ -2103,7 +1077,7 @@
                 <w:color w:val="2A3831"/>
                 <w:sz w:val="18"/>
               </w:rPr>
-              <w:t># ===== Python recommendation-service (.env / app/config.py) =====</w:t>
+              <w:t># ===== Python recommendation-service (.env) =====</w:t>
             </w:r>
             <w:r>
               <w:rPr>
@@ -2119,7 +1093,7 @@
                 <w:color w:val="2A3831"/>
                 <w:sz w:val="18"/>
               </w:rPr>
-              <w:t>search_model_dir=data/models/multilingual-e5-small</w:t>
+              <w:t>search_sem_min_sim=0.80              # ngưỡng tin cậy tối thiểu để nhận 1 sản phẩm</w:t>
             </w:r>
             <w:r>
               <w:rPr>
@@ -2127,7 +1101,7 @@
                 <w:color w:val="2A3831"/>
                 <w:sz w:val="18"/>
               </w:rPr>
-              <w:t>search_sem_min_sim=0.80</w:t>
+              <w:t>search_sem_top1_gate=0.82            # ngưỡng để coi từ khoá là "có ý nghĩa"</w:t>
             </w:r>
             <w:r>
               <w:rPr>
@@ -2135,7 +1109,7 @@
                 <w:color w:val="2A3831"/>
                 <w:sz w:val="18"/>
               </w:rPr>
-              <w:t>search_sem_top1_gate=0.82</w:t>
+              <w:t>w_search_lexical=1.0                 # mức độ quan trọng: khớp đúng tên</w:t>
             </w:r>
             <w:r>
               <w:rPr>
@@ -2143,7 +1117,7 @@
                 <w:color w:val="2A3831"/>
                 <w:sz w:val="18"/>
               </w:rPr>
-              <w:t>search_tfidf_min_sim=0.05</w:t>
+              <w:t>w_search_semantic=0.8                # mức độ quan trọng: AI hiểu ý nghĩa</w:t>
             </w:r>
             <w:r>
               <w:rPr>
@@ -2151,7 +1125,7 @@
                 <w:color w:val="2A3831"/>
                 <w:sz w:val="18"/>
               </w:rPr>
-              <w:t>search_sem_top_k=100</w:t>
+              <w:t>w_search_personal=0.5                # mức độ quan trọng: hợp sở thích cá nhân</w:t>
             </w:r>
             <w:r>
               <w:rPr>
@@ -2159,39 +1133,7 @@
                 <w:color w:val="2A3831"/>
                 <w:sz w:val="18"/>
               </w:rPr>
-              <w:t>search_max_ranked=500                # trần số item trả cho Java phân trang</w:t>
-            </w:r>
-            <w:r>
-              <w:rPr>
-                <w:rFonts w:ascii="Consolas" w:hAnsi="Consolas"/>
-                <w:color w:val="2A3831"/>
-                <w:sz w:val="18"/>
-              </w:rPr>
-              <w:t>w_search_lexical=1.0</w:t>
-            </w:r>
-            <w:r>
-              <w:rPr>
-                <w:rFonts w:ascii="Consolas" w:hAnsi="Consolas"/>
-                <w:color w:val="2A3831"/>
-                <w:sz w:val="18"/>
-              </w:rPr>
-              <w:t>w_search_semantic=0.8</w:t>
-            </w:r>
-            <w:r>
-              <w:rPr>
-                <w:rFonts w:ascii="Consolas" w:hAnsi="Consolas"/>
-                <w:color w:val="2A3831"/>
-                <w:sz w:val="18"/>
-              </w:rPr>
-              <w:t>w_search_personal=0.5</w:t>
-            </w:r>
-            <w:r>
-              <w:rPr>
-                <w:rFonts w:ascii="Consolas" w:hAnsi="Consolas"/>
-                <w:color w:val="2A3831"/>
-                <w:sz w:val="18"/>
-              </w:rPr>
-              <w:t>w_search_popularity=0.15</w:t>
+              <w:t>w_search_popularity=0.15             # mức độ quan trọng: độ phổ biến</w:t>
             </w:r>
             <w:r>
               <w:rPr>
@@ -2214,7 +1156,7 @@
                 <w:color w:val="2A3831"/>
                 <w:sz w:val="18"/>
               </w:rPr>
-              <w:t>recommendation.search.enabled=true   # kill-switch không cần sửa code</w:t>
+              <w:t>recommendation.search.enabled=true   # bật/tắt tính năng AI, không cần sửa code</w:t>
             </w:r>
             <w:r>
               <w:rPr>
@@ -2242,7 +1184,7 @@
         <w:pStyle w:val="Heading2"/>
       </w:pPr>
       <w:r>
-        <w:t>3. Nguyên tắc bất di bất dịch (nhắc lại)</w:t>
+        <w:t>3. Nguyên tắc không được phá vỡ</w:t>
       </w:r>
     </w:p>
     <w:p>
@@ -2250,7 +1192,7 @@
         <w:pStyle w:val="ListNumber"/>
       </w:pPr>
       <w:r>
-        <w:t>Không tầng nào được làm vỡ trang tìm kiếm — tệ nhất là kết quả LIKE như hôm nay.</w:t>
+        <w:t>Không được để bất kỳ sự cố nào của AI làm hỏng trang tìm kiếm — tệ nhất chỉ là quay về cách tìm kiếm cũ.</w:t>
       </w:r>
     </w:p>
     <w:p>
@@ -2258,7 +1200,7 @@
         <w:pStyle w:val="ListNumber"/>
       </w:pPr>
       <w:r>
-        <w:t>Filter cứng tôn trọng tuyệt đối bằng cấu trúc (Python chỉ xếp hạng trong allowed_ids).</w:t>
+        <w:t>Điều kiện lọc luôn được tôn trọng tuyệt đối, AI không được vượt qua.</w:t>
       </w:r>
     </w:p>
     <w:p>
@@ -2266,7 +1208,7 @@
         <w:pStyle w:val="ListNumber"/>
       </w:pPr>
       <w:r>
-        <w:t>Tiếng Việt có dấu chỉ đi qua JSON body; không nới timeout bean recommendationRestTemplate.</w:t>
+        <w:t>Từ khoá có dấu chỉ gửi qua nội dung yêu cầu, không qua URL; thời gian chờ dịch vụ AI không được nới ra.</w:t>
       </w:r>
     </w:p>
     <w:p>
@@ -2274,7 +1216,7 @@
         <w:pStyle w:val="ListNumber"/>
       </w:pPr>
       <w:r>
-        <w:t>Spike cài thư viện trên Windows PASS rồi mới code; rule bảo mật khai đúng từng HttpMethod.</w:t>
+        <w:t>Thư viện mới phải thử cài đặt thành công trước khi viết code; API quản trị phải khai quyền rõ theo từng loại yêu cầu.</w:t>
       </w:r>
     </w:p>
     <w:p>
@@ -2282,7 +1224,7 @@
         <w:pStyle w:val="ListNumber"/>
       </w:pPr>
       <w:r>
-        <w:t>Mọi ngưỡng/trọng số qua .env, có bước calibrate bằng dữ liệu thật trước khi tin.</w:t>
+        <w:t>Mọi ngưỡng và trọng số đều chỉnh qua cấu hình, và phải kiểm tra bằng dữ liệu thật trước khi tin tưởng.</w:t>
       </w:r>
     </w:p>
     <w:sectPr>

</xml_diff>